<commit_message>
Resume: add Tools & Technologies keyword line for ATS keyword scans
Reviewers flagged missing keywords (React, Next.js, Tailwind, TypeScript,
etc.). Adds a dedicated, keyword-dense "Tools & Technologies" line with
exact tokens, mirrored across all three resume sources that were kept in
sync by hand:
- components/resume/resumeData.ts (new `tools` array) + Resume.tsx renders
  a full-width row below Highlights/Skills, before Experience
- scripts/make-resume-pdf.py + regenerated public/dave-keller-resume.pdf
  (compact keyword style + slightly tighter section/job gaps keep it 2 pages)
- scripts/make-resume-docx.js + regenerated public/dave-keller-resume.docx

Keywords are only ones backed by the resume/codebase — no invented skills.

Co-Authored-By: Claude Opus 4.8 <noreply@anthropic.com>
</commit_message>
<xml_diff>
--- a/public/dave-keller-resume.docx
+++ b/public/dave-keller-resume.docx
@@ -140,7 +140,7 @@
               </w:rPr>
               <w:t xml:space="preserve">512.595.6213  |  </w:t>
             </w:r>
-            <w:hyperlink w:history="1" r:id="rIdjn8cnldbfpagxdjj88bku">
+            <w:hyperlink w:history="1" r:id="rIdpd-agd_5nbbpipepreru8">
               <w:r>
                 <w:rPr>
                   <w:rFonts w:ascii="Arial" w:cs="Arial" w:eastAsia="Arial" w:hAnsi="Arial"/>
@@ -158,7 +158,7 @@
               <w:br/>
               <w:t xml:space="preserve"/>
             </w:r>
-            <w:hyperlink w:history="1" r:id="rIdv5d6xjtni77f746bcprah">
+            <w:hyperlink w:history="1" r:id="rIdwq3vjyyka7h9632t2j1a-">
               <w:r>
                 <w:rPr>
                   <w:rFonts w:ascii="Arial" w:cs="Arial" w:eastAsia="Arial" w:hAnsi="Arial"/>
@@ -176,7 +176,7 @@
               <w:br/>
               <w:t xml:space="preserve"/>
             </w:r>
-            <w:hyperlink w:history="1" r:id="rIdbapoweodrz2twpcac6ln6">
+            <w:hyperlink w:history="1" r:id="rId7tevn5xuk5et-0r3huhzm">
               <w:r>
                 <w:rPr>
                   <w:rFonts w:ascii="Arial" w:cs="Arial" w:eastAsia="Arial" w:hAnsi="Arial"/>
@@ -375,6 +375,37 @@
           <w:rFonts w:ascii="Arial" w:cs="Arial" w:eastAsia="Arial" w:hAnsi="Arial"/>
         </w:rPr>
         <w:t xml:space="preserve">Fluent in GitHub — push/pull, branches, and PRs; Linear, Trello and Notion for sprint planning and docs</w:t>
+      </w:r>
+    </w:p>
+    <w:p>
+      <w:pPr>
+        <w:pBdr>
+          <w:bottom w:val="single" w:color="DDDDDD" w:sz="4" w:space="4"/>
+        </w:pBdr>
+        <w:spacing w:after="120" w:before="320" w:line="260" w:lineRule="atLeast"/>
+      </w:pPr>
+      <w:r>
+        <w:rPr>
+          <w:rFonts w:ascii="Arial" w:cs="Arial" w:eastAsia="Arial" w:hAnsi="Arial"/>
+          <w:b/>
+          <w:bCs/>
+          <w:color w:val="999999"/>
+          <w:spacing w:val="36"/>
+          <w:sz w:val="18"/>
+          <w:szCs w:val="18"/>
+        </w:rPr>
+        <w:t xml:space="preserve">TOOLS &amp; TECHNOLOGIES</w:t>
+      </w:r>
+    </w:p>
+    <w:p>
+      <w:pPr>
+        <w:spacing w:line="260" w:lineRule="atLeast"/>
+      </w:pPr>
+      <w:r>
+        <w:rPr>
+          <w:rFonts w:ascii="Arial" w:cs="Arial" w:eastAsia="Arial" w:hAnsi="Arial"/>
+        </w:rPr>
+        <w:t xml:space="preserve">React · Next.js · TypeScript · JavaScript · HTML · CSS · Tailwind CSS · Elixir · Three.js / React Three Fiber · Framer Motion · Figma · design systems · component libraries · prototyping · wireframing · responsive design · interaction design · motion design · front-end development · UI/UX design · product design · Git · GitHub · Claude Code · Cursor · Linear · Notion · iOS · Android · Agile · Shape Up · design sprints</w:t>
       </w:r>
     </w:p>
     <w:p>

</xml_diff>

<commit_message>
Resume: move Tools & Technologies under Interests; edit keyword list
- Relocate the keyword line to the bottom of the resume (after Interests)
  across web, PDF, and DOCX.
- Reorder/trim keywords per review: Figma first; drop Elixir and Three.js.
- Regenerated PDF (still 2 pages) and DOCX.

Co-Authored-By: Claude Opus 4.8 <noreply@anthropic.com>
</commit_message>
<xml_diff>
--- a/public/dave-keller-resume.docx
+++ b/public/dave-keller-resume.docx
@@ -140,7 +140,7 @@
               </w:rPr>
               <w:t xml:space="preserve">512.595.6213  |  </w:t>
             </w:r>
-            <w:hyperlink w:history="1" r:id="rIdpd-agd_5nbbpipepreru8">
+            <w:hyperlink w:history="1" r:id="rId5f6lkmu8pgzodx7gtonx3">
               <w:r>
                 <w:rPr>
                   <w:rFonts w:ascii="Arial" w:cs="Arial" w:eastAsia="Arial" w:hAnsi="Arial"/>
@@ -158,7 +158,7 @@
               <w:br/>
               <w:t xml:space="preserve"/>
             </w:r>
-            <w:hyperlink w:history="1" r:id="rIdwq3vjyyka7h9632t2j1a-">
+            <w:hyperlink w:history="1" r:id="rIdpa2s8fmbosa_jmg0p9_ia">
               <w:r>
                 <w:rPr>
                   <w:rFonts w:ascii="Arial" w:cs="Arial" w:eastAsia="Arial" w:hAnsi="Arial"/>
@@ -176,7 +176,7 @@
               <w:br/>
               <w:t xml:space="preserve"/>
             </w:r>
-            <w:hyperlink w:history="1" r:id="rId7tevn5xuk5et-0r3huhzm">
+            <w:hyperlink w:history="1" r:id="rIdtzveqbou3ks7i83kxqbeu">
               <w:r>
                 <w:rPr>
                   <w:rFonts w:ascii="Arial" w:cs="Arial" w:eastAsia="Arial" w:hAnsi="Arial"/>
@@ -375,37 +375,6 @@
           <w:rFonts w:ascii="Arial" w:cs="Arial" w:eastAsia="Arial" w:hAnsi="Arial"/>
         </w:rPr>
         <w:t xml:space="preserve">Fluent in GitHub — push/pull, branches, and PRs; Linear, Trello and Notion for sprint planning and docs</w:t>
-      </w:r>
-    </w:p>
-    <w:p>
-      <w:pPr>
-        <w:pBdr>
-          <w:bottom w:val="single" w:color="DDDDDD" w:sz="4" w:space="4"/>
-        </w:pBdr>
-        <w:spacing w:after="120" w:before="320" w:line="260" w:lineRule="atLeast"/>
-      </w:pPr>
-      <w:r>
-        <w:rPr>
-          <w:rFonts w:ascii="Arial" w:cs="Arial" w:eastAsia="Arial" w:hAnsi="Arial"/>
-          <w:b/>
-          <w:bCs/>
-          <w:color w:val="999999"/>
-          <w:spacing w:val="36"/>
-          <w:sz w:val="18"/>
-          <w:szCs w:val="18"/>
-        </w:rPr>
-        <w:t xml:space="preserve">TOOLS &amp; TECHNOLOGIES</w:t>
-      </w:r>
-    </w:p>
-    <w:p>
-      <w:pPr>
-        <w:spacing w:line="260" w:lineRule="atLeast"/>
-      </w:pPr>
-      <w:r>
-        <w:rPr>
-          <w:rFonts w:ascii="Arial" w:cs="Arial" w:eastAsia="Arial" w:hAnsi="Arial"/>
-        </w:rPr>
-        <w:t xml:space="preserve">React · Next.js · TypeScript · JavaScript · HTML · CSS · Tailwind CSS · Elixir · Three.js / React Three Fiber · Framer Motion · Figma · design systems · component libraries · prototyping · wireframing · responsive design · interaction design · motion design · front-end development · UI/UX design · product design · Git · GitHub · Claude Code · Cursor · Linear · Notion · iOS · Android · Agile · Shape Up · design sprints</w:t>
       </w:r>
     </w:p>
     <w:p>
@@ -1565,6 +1534,37 @@
           <w:rFonts w:ascii="Arial" w:cs="Arial" w:eastAsia="Arial" w:hAnsi="Arial"/>
         </w:rPr>
         <w:t xml:space="preserve">Guitar and vocals in a rock/metal band · Recording and mixing in Logic Pro · Indoor soccer and racquetball · Mountain biking and endurance sports · International travel (fluent in Spanish) · Adventures with my kids</w:t>
+      </w:r>
+    </w:p>
+    <w:p>
+      <w:pPr>
+        <w:pBdr>
+          <w:bottom w:val="single" w:color="DDDDDD" w:sz="4" w:space="4"/>
+        </w:pBdr>
+        <w:spacing w:after="120" w:before="320" w:line="260" w:lineRule="atLeast"/>
+      </w:pPr>
+      <w:r>
+        <w:rPr>
+          <w:rFonts w:ascii="Arial" w:cs="Arial" w:eastAsia="Arial" w:hAnsi="Arial"/>
+          <w:b/>
+          <w:bCs/>
+          <w:color w:val="999999"/>
+          <w:spacing w:val="36"/>
+          <w:sz w:val="18"/>
+          <w:szCs w:val="18"/>
+        </w:rPr>
+        <w:t xml:space="preserve">TOOLS &amp; TECHNOLOGIES</w:t>
+      </w:r>
+    </w:p>
+    <w:p>
+      <w:pPr>
+        <w:spacing w:line="260" w:lineRule="atLeast"/>
+      </w:pPr>
+      <w:r>
+        <w:rPr>
+          <w:rFonts w:ascii="Arial" w:cs="Arial" w:eastAsia="Arial" w:hAnsi="Arial"/>
+        </w:rPr>
+        <w:t xml:space="preserve">Figma · React · Next.js · TypeScript · JavaScript · HTML · CSS · Tailwind CSS · Framer Motion · design systems · component libraries · prototyping · wireframing · responsive design · interaction design · motion design · front-end development · UI/UX design · product design · Git · GitHub · Claude Code · Cursor · Linear · Notion · iOS · Android · Agile · Shape Up · design sprints</w:t>
       </w:r>
     </w:p>
     <w:sectPr>

</xml_diff>

<commit_message>
Resume: rename top section "Skills & Tools" → "Skills"
The bottom keyword section owns "Tools & Technologies" now, so the
top-right list reads simply "Skills". Applied to web, PDF, and DOCX;
regenerated both files (PDF still 2 pages).

Co-Authored-By: Claude Opus 4.8 <noreply@anthropic.com>
</commit_message>
<xml_diff>
--- a/public/dave-keller-resume.docx
+++ b/public/dave-keller-resume.docx
@@ -140,7 +140,7 @@
               </w:rPr>
               <w:t xml:space="preserve">512.595.6213  |  </w:t>
             </w:r>
-            <w:hyperlink w:history="1" r:id="rId5f6lkmu8pgzodx7gtonx3">
+            <w:hyperlink w:history="1" r:id="rIdtjawlpns_3_xk5nwq18cf">
               <w:r>
                 <w:rPr>
                   <w:rFonts w:ascii="Arial" w:cs="Arial" w:eastAsia="Arial" w:hAnsi="Arial"/>
@@ -158,7 +158,7 @@
               <w:br/>
               <w:t xml:space="preserve"/>
             </w:r>
-            <w:hyperlink w:history="1" r:id="rIdpa2s8fmbosa_jmg0p9_ia">
+            <w:hyperlink w:history="1" r:id="rIdadias23vyk11q50btqw8p">
               <w:r>
                 <w:rPr>
                   <w:rFonts w:ascii="Arial" w:cs="Arial" w:eastAsia="Arial" w:hAnsi="Arial"/>
@@ -176,7 +176,7 @@
               <w:br/>
               <w:t xml:space="preserve"/>
             </w:r>
-            <w:hyperlink w:history="1" r:id="rIdtzveqbou3ks7i83kxqbeu">
+            <w:hyperlink w:history="1" r:id="rIdsudo8xr3hne6jkzeaciqd">
               <w:r>
                 <w:rPr>
                   <w:rFonts w:ascii="Arial" w:cs="Arial" w:eastAsia="Arial" w:hAnsi="Arial"/>
@@ -302,7 +302,7 @@
           <w:sz w:val="18"/>
           <w:szCs w:val="18"/>
         </w:rPr>
-        <w:t xml:space="preserve">SKILLS &amp; TOOLS</w:t>
+        <w:t xml:space="preserve">SKILLS</w:t>
       </w:r>
     </w:p>
     <w:p>

</xml_diff>

<commit_message>
Resume: revise Tools & Technologies skill set
Updated per Dave's edits: add Photoshop, Codex, data-viz (Recharts / D3 /
OpenMaps), React Flow, Framer, Webflow; regroup and reorder the web grid
(18 cells). Flat token list + regenerated PDF/DOCX kept in sync for ATS
(still 2 pages).

Co-Authored-By: Claude Opus 4.8 <noreply@anthropic.com>
</commit_message>
<xml_diff>
--- a/public/dave-keller-resume.docx
+++ b/public/dave-keller-resume.docx
@@ -140,7 +140,7 @@
               </w:rPr>
               <w:t xml:space="preserve">512.595.6213  |  </w:t>
             </w:r>
-            <w:hyperlink w:history="1" r:id="rIdtjawlpns_3_xk5nwq18cf">
+            <w:hyperlink w:history="1" r:id="rIdlgliyxgvzys_ykiig81l6">
               <w:r>
                 <w:rPr>
                   <w:rFonts w:ascii="Arial" w:cs="Arial" w:eastAsia="Arial" w:hAnsi="Arial"/>
@@ -158,7 +158,7 @@
               <w:br/>
               <w:t xml:space="preserve"/>
             </w:r>
-            <w:hyperlink w:history="1" r:id="rIdadias23vyk11q50btqw8p">
+            <w:hyperlink w:history="1" r:id="rIds2urr_ucwaumn3o7mjvkr">
               <w:r>
                 <w:rPr>
                   <w:rFonts w:ascii="Arial" w:cs="Arial" w:eastAsia="Arial" w:hAnsi="Arial"/>
@@ -176,7 +176,7 @@
               <w:br/>
               <w:t xml:space="preserve"/>
             </w:r>
-            <w:hyperlink w:history="1" r:id="rIdsudo8xr3hne6jkzeaciqd">
+            <w:hyperlink w:history="1" r:id="rIdoga2y-yepvr2jiufzn5rc">
               <w:r>
                 <w:rPr>
                   <w:rFonts w:ascii="Arial" w:cs="Arial" w:eastAsia="Arial" w:hAnsi="Arial"/>
@@ -1564,7 +1564,7 @@
         <w:rPr>
           <w:rFonts w:ascii="Arial" w:cs="Arial" w:eastAsia="Arial" w:hAnsi="Arial"/>
         </w:rPr>
-        <w:t xml:space="preserve">Figma · React · Next.js · TypeScript · JavaScript · HTML · CSS · Tailwind CSS · Framer Motion · design systems · component libraries · prototyping · wireframing · responsive design · interaction design · motion design · front-end development · UI/UX design · product design · Git · GitHub · Claude Code · Cursor · Linear · Notion · iOS · Android · Agile · Shape Up · design sprints</w:t>
+        <w:t xml:space="preserve">Figma · Photoshop · React · Next.js · HTML · CSS · Tailwind CSS · JavaScript · TypeScript · Claude Code · Codex · Cursor · Git · GitHub · data visualization · Recharts · D3 · OpenMaps · React Flow · Framer Motion · Framer · Webflow · design systems · component libraries · prototyping · wireframing · responsive design · interaction design · motion design · front-end development · product design · UI/UX design · Linear · Notion · iOS · Android · Agile · Shape Up · design sprints</w:t>
       </w:r>
     </w:p>
     <w:sectPr>

</xml_diff>

<commit_message>
Resume: tighten Interests spacing, fix A Beautiful Mess wording, sync ATS keywords
- Interests grid now uses the same tight gap as the Tools grid (gap-y-1).
- "a photo editor that" → "a photo editing app that" (web, PDF, DOCX).
- Add VR + marketing sites to the flat ATS keyword list; regenerated
  PDF/DOCX (still 2 pages). PDF/DOCX keep the comprehensive keyword set;
  the web grid stays the curated 3×5 category view.

Co-Authored-By: Claude Opus 4.8 <noreply@anthropic.com>
</commit_message>
<xml_diff>
--- a/public/dave-keller-resume.docx
+++ b/public/dave-keller-resume.docx
@@ -140,7 +140,7 @@
               </w:rPr>
               <w:t xml:space="preserve">512.595.6213  |  </w:t>
             </w:r>
-            <w:hyperlink w:history="1" r:id="rIdlgliyxgvzys_ykiig81l6">
+            <w:hyperlink w:history="1" r:id="rIdblrb4bqpd7rkwoxlxtcmw">
               <w:r>
                 <w:rPr>
                   <w:rFonts w:ascii="Arial" w:cs="Arial" w:eastAsia="Arial" w:hAnsi="Arial"/>
@@ -158,7 +158,7 @@
               <w:br/>
               <w:t xml:space="preserve"/>
             </w:r>
-            <w:hyperlink w:history="1" r:id="rIds2urr_ucwaumn3o7mjvkr">
+            <w:hyperlink w:history="1" r:id="rIdch0jnrzkypfasjtz8hgmd">
               <w:r>
                 <w:rPr>
                   <w:rFonts w:ascii="Arial" w:cs="Arial" w:eastAsia="Arial" w:hAnsi="Arial"/>
@@ -176,7 +176,7 @@
               <w:br/>
               <w:t xml:space="preserve"/>
             </w:r>
-            <w:hyperlink w:history="1" r:id="rIdoga2y-yepvr2jiufzn5rc">
+            <w:hyperlink w:history="1" r:id="rIdveixblzazdrn44gsgrjmy">
               <w:r>
                 <w:rPr>
                   <w:rFonts w:ascii="Arial" w:cs="Arial" w:eastAsia="Arial" w:hAnsi="Arial"/>
@@ -1484,7 +1484,7 @@
         <w:rPr>
           <w:rFonts w:ascii="Arial" w:cs="Arial" w:eastAsia="Arial" w:hAnsi="Arial"/>
         </w:rPr>
-        <w:t xml:space="preserve">Designed and shipped A Beautiful Mess, a photo editor that hit #1 Paid on the App Store and held top-100 for over a year</w:t>
+        <w:t xml:space="preserve">Designed and shipped A Beautiful Mess, a photo editing app that hit #1 Paid on the App Store and held top-100 for over a year</w:t>
       </w:r>
     </w:p>
     <w:p>
@@ -1564,7 +1564,7 @@
         <w:rPr>
           <w:rFonts w:ascii="Arial" w:cs="Arial" w:eastAsia="Arial" w:hAnsi="Arial"/>
         </w:rPr>
-        <w:t xml:space="preserve">Figma · Photoshop · React · Next.js · HTML · CSS · Tailwind CSS · JavaScript · TypeScript · Claude Code · Codex · Cursor · Git · GitHub · data visualization · Recharts · D3 · OpenMaps · React Flow · Framer Motion · Framer · Webflow · design systems · component libraries · prototyping · wireframing · responsive design · interaction design · motion design · front-end development · product design · UI/UX design · Linear · Notion · iOS · Android · Agile · Shape Up · design sprints</w:t>
+        <w:t xml:space="preserve">Figma · Photoshop · React · Next.js · HTML · CSS · Tailwind CSS · JavaScript · TypeScript · Claude Code · Codex · Cursor · Git · GitHub · data visualization · Recharts · D3 · OpenMaps · React Flow · Framer Motion · Framer · Webflow · marketing sites · design systems · component libraries · prototyping · wireframing · responsive design · interaction design · motion design · front-end development · product design · UI/UX design · Linear · Notion · iOS · Android · VR · Agile · Shape Up · design sprints</w:t>
       </w:r>
     </w:p>
     <w:sectPr>

</xml_diff>

<commit_message>
Resume: sync PDF/DOCX to the web Tools & Technologies layout
Match the web version everywhere: the PDF and DOCX now render the same
15 grouped items in a 3-column, column-by-column category grid (instead
of the long comprehensive keyword line). toolGroups is now the single
source of truth; dropped the unused flat `tools` export. Compact cell
sizing keeps the PDF at 2 pages.

Co-Authored-By: Claude Opus 4.8 <noreply@anthropic.com>
</commit_message>
<xml_diff>
--- a/public/dave-keller-resume.docx
+++ b/public/dave-keller-resume.docx
@@ -140,7 +140,7 @@
               </w:rPr>
               <w:t xml:space="preserve">512.595.6213  |  </w:t>
             </w:r>
-            <w:hyperlink w:history="1" r:id="rIdblrb4bqpd7rkwoxlxtcmw">
+            <w:hyperlink w:history="1" r:id="rIdydoxbnqgl8vmjf7o-ozud">
               <w:r>
                 <w:rPr>
                   <w:rFonts w:ascii="Arial" w:cs="Arial" w:eastAsia="Arial" w:hAnsi="Arial"/>
@@ -158,7 +158,7 @@
               <w:br/>
               <w:t xml:space="preserve"/>
             </w:r>
-            <w:hyperlink w:history="1" r:id="rIdch0jnrzkypfasjtz8hgmd">
+            <w:hyperlink w:history="1" r:id="rIdw-1lwtwjv4vgjx6lviqco">
               <w:r>
                 <w:rPr>
                   <w:rFonts w:ascii="Arial" w:cs="Arial" w:eastAsia="Arial" w:hAnsi="Arial"/>
@@ -176,7 +176,7 @@
               <w:br/>
               <w:t xml:space="preserve"/>
             </w:r>
-            <w:hyperlink w:history="1" r:id="rIdveixblzazdrn44gsgrjmy">
+            <w:hyperlink w:history="1" r:id="rIdyxctqa6xvy-bszfywfuge">
               <w:r>
                 <w:rPr>
                   <w:rFonts w:ascii="Arial" w:cs="Arial" w:eastAsia="Arial" w:hAnsi="Arial"/>
@@ -1556,17 +1556,529 @@
         <w:t xml:space="preserve">TOOLS &amp; TECHNOLOGIES</w:t>
       </w:r>
     </w:p>
-    <w:p>
-      <w:pPr>
-        <w:spacing w:line="260" w:lineRule="atLeast"/>
-      </w:pPr>
-      <w:r>
-        <w:rPr>
-          <w:rFonts w:ascii="Arial" w:cs="Arial" w:eastAsia="Arial" w:hAnsi="Arial"/>
-        </w:rPr>
-        <w:t xml:space="preserve">Figma · Photoshop · React · Next.js · HTML · CSS · Tailwind CSS · JavaScript · TypeScript · Claude Code · Codex · Cursor · Git · GitHub · data visualization · Recharts · D3 · OpenMaps · React Flow · Framer Motion · Framer · Webflow · marketing sites · design systems · component libraries · prototyping · wireframing · responsive design · interaction design · motion design · front-end development · product design · UI/UX design · Linear · Notion · iOS · Android · VR · Agile · Shape Up · design sprints</w:t>
-      </w:r>
-    </w:p>
+    <w:tbl>
+      <w:tblPr>
+        <w:tblW w:type="dxa" w:w="10080"/>
+        <w:tblBorders>
+          <w:top w:val="none" w:color="auto" w:sz="0"/>
+          <w:left w:val="none" w:color="auto" w:sz="0"/>
+          <w:bottom w:val="none" w:color="auto" w:sz="0"/>
+          <w:right w:val="none" w:color="auto" w:sz="0"/>
+          <w:insideH w:val="none" w:color="auto" w:sz="0"/>
+          <w:insideV w:val="none" w:color="auto" w:sz="0"/>
+        </w:tblBorders>
+      </w:tblPr>
+      <w:tblGrid>
+        <w:gridCol w:w="3360"/>
+        <w:gridCol w:w="3360"/>
+        <w:gridCol w:w="3360"/>
+      </w:tblGrid>
+      <w:tr>
+        <w:tc>
+          <w:tcPr>
+            <w:tcW w:type="dxa" w:w="3360"/>
+            <w:tcBorders>
+              <w:top w:val="none" w:color="auto" w:sz="0"/>
+              <w:left w:val="none" w:color="auto" w:sz="0"/>
+              <w:bottom w:val="none" w:color="auto" w:sz="0"/>
+              <w:right w:val="none" w:color="auto" w:sz="0"/>
+            </w:tcBorders>
+            <w:tcMar>
+              <w:top w:type="dxa" w:w="18"/>
+              <w:left w:type="dxa" w:w="0"/>
+              <w:bottom w:type="dxa" w:w="18"/>
+              <w:right w:type="dxa" w:w="120"/>
+            </w:tcMar>
+          </w:tcPr>
+          <w:p>
+            <w:pPr>
+              <w:pStyle w:val="ListParagraph"/>
+              <w:numPr>
+                <w:ilvl w:val="0"/>
+                <w:numId w:val="2"/>
+              </w:numPr>
+              <w:spacing w:after="0" w:line="260" w:lineRule="atLeast"/>
+            </w:pPr>
+            <w:r>
+              <w:rPr>
+                <w:rFonts w:ascii="Arial" w:cs="Arial" w:eastAsia="Arial" w:hAnsi="Arial"/>
+              </w:rPr>
+              <w:t xml:space="preserve">Figma / Photoshop</w:t>
+            </w:r>
+          </w:p>
+        </w:tc>
+        <w:tc>
+          <w:tcPr>
+            <w:tcW w:type="dxa" w:w="3360"/>
+            <w:tcBorders>
+              <w:top w:val="none" w:color="auto" w:sz="0"/>
+              <w:left w:val="none" w:color="auto" w:sz="0"/>
+              <w:bottom w:val="none" w:color="auto" w:sz="0"/>
+              <w:right w:val="none" w:color="auto" w:sz="0"/>
+            </w:tcBorders>
+            <w:tcMar>
+              <w:top w:type="dxa" w:w="18"/>
+              <w:left w:type="dxa" w:w="0"/>
+              <w:bottom w:type="dxa" w:w="18"/>
+              <w:right w:type="dxa" w:w="120"/>
+            </w:tcMar>
+          </w:tcPr>
+          <w:p>
+            <w:pPr>
+              <w:pStyle w:val="ListParagraph"/>
+              <w:numPr>
+                <w:ilvl w:val="0"/>
+                <w:numId w:val="2"/>
+              </w:numPr>
+              <w:spacing w:after="0" w:line="260" w:lineRule="atLeast"/>
+            </w:pPr>
+            <w:r>
+              <w:rPr>
+                <w:rFonts w:ascii="Arial" w:cs="Arial" w:eastAsia="Arial" w:hAnsi="Arial"/>
+              </w:rPr>
+              <w:t xml:space="preserve">Git / GitHub</w:t>
+            </w:r>
+          </w:p>
+        </w:tc>
+        <w:tc>
+          <w:tcPr>
+            <w:tcW w:type="dxa" w:w="3360"/>
+            <w:tcBorders>
+              <w:top w:val="none" w:color="auto" w:sz="0"/>
+              <w:left w:val="none" w:color="auto" w:sz="0"/>
+              <w:bottom w:val="none" w:color="auto" w:sz="0"/>
+              <w:right w:val="none" w:color="auto" w:sz="0"/>
+            </w:tcBorders>
+            <w:tcMar>
+              <w:top w:type="dxa" w:w="18"/>
+              <w:left w:type="dxa" w:w="0"/>
+              <w:bottom w:type="dxa" w:w="18"/>
+              <w:right w:type="dxa" w:w="120"/>
+            </w:tcMar>
+          </w:tcPr>
+          <w:p>
+            <w:pPr>
+              <w:pStyle w:val="ListParagraph"/>
+              <w:numPr>
+                <w:ilvl w:val="0"/>
+                <w:numId w:val="2"/>
+              </w:numPr>
+              <w:spacing w:after="0" w:line="260" w:lineRule="atLeast"/>
+            </w:pPr>
+            <w:r>
+              <w:rPr>
+                <w:rFonts w:ascii="Arial" w:cs="Arial" w:eastAsia="Arial" w:hAnsi="Arial"/>
+              </w:rPr>
+              <w:t xml:space="preserve">design systems / component libraries</w:t>
+            </w:r>
+          </w:p>
+        </w:tc>
+      </w:tr>
+      <w:tr>
+        <w:tc>
+          <w:tcPr>
+            <w:tcW w:type="dxa" w:w="3360"/>
+            <w:tcBorders>
+              <w:top w:val="none" w:color="auto" w:sz="0"/>
+              <w:left w:val="none" w:color="auto" w:sz="0"/>
+              <w:bottom w:val="none" w:color="auto" w:sz="0"/>
+              <w:right w:val="none" w:color="auto" w:sz="0"/>
+            </w:tcBorders>
+            <w:tcMar>
+              <w:top w:type="dxa" w:w="18"/>
+              <w:left w:type="dxa" w:w="0"/>
+              <w:bottom w:type="dxa" w:w="18"/>
+              <w:right w:type="dxa" w:w="120"/>
+            </w:tcMar>
+          </w:tcPr>
+          <w:p>
+            <w:pPr>
+              <w:pStyle w:val="ListParagraph"/>
+              <w:numPr>
+                <w:ilvl w:val="0"/>
+                <w:numId w:val="2"/>
+              </w:numPr>
+              <w:spacing w:after="0" w:line="260" w:lineRule="atLeast"/>
+            </w:pPr>
+            <w:r>
+              <w:rPr>
+                <w:rFonts w:ascii="Arial" w:cs="Arial" w:eastAsia="Arial" w:hAnsi="Arial"/>
+              </w:rPr>
+              <w:t xml:space="preserve">Claude Code / Codex / Cursor</w:t>
+            </w:r>
+          </w:p>
+        </w:tc>
+        <w:tc>
+          <w:tcPr>
+            <w:tcW w:type="dxa" w:w="3360"/>
+            <w:tcBorders>
+              <w:top w:val="none" w:color="auto" w:sz="0"/>
+              <w:left w:val="none" w:color="auto" w:sz="0"/>
+              <w:bottom w:val="none" w:color="auto" w:sz="0"/>
+              <w:right w:val="none" w:color="auto" w:sz="0"/>
+            </w:tcBorders>
+            <w:tcMar>
+              <w:top w:type="dxa" w:w="18"/>
+              <w:left w:type="dxa" w:w="0"/>
+              <w:bottom w:type="dxa" w:w="18"/>
+              <w:right w:type="dxa" w:w="120"/>
+            </w:tcMar>
+          </w:tcPr>
+          <w:p>
+            <w:pPr>
+              <w:pStyle w:val="ListParagraph"/>
+              <w:numPr>
+                <w:ilvl w:val="0"/>
+                <w:numId w:val="2"/>
+              </w:numPr>
+              <w:spacing w:after="0" w:line="260" w:lineRule="atLeast"/>
+            </w:pPr>
+            <w:r>
+              <w:rPr>
+                <w:rFonts w:ascii="Arial" w:cs="Arial" w:eastAsia="Arial" w:hAnsi="Arial"/>
+              </w:rPr>
+              <w:t xml:space="preserve">Data Viz and Animation libraries</w:t>
+            </w:r>
+          </w:p>
+        </w:tc>
+        <w:tc>
+          <w:tcPr>
+            <w:tcW w:type="dxa" w:w="3360"/>
+            <w:tcBorders>
+              <w:top w:val="none" w:color="auto" w:sz="0"/>
+              <w:left w:val="none" w:color="auto" w:sz="0"/>
+              <w:bottom w:val="none" w:color="auto" w:sz="0"/>
+              <w:right w:val="none" w:color="auto" w:sz="0"/>
+            </w:tcBorders>
+            <w:tcMar>
+              <w:top w:type="dxa" w:w="18"/>
+              <w:left w:type="dxa" w:w="0"/>
+              <w:bottom w:type="dxa" w:w="18"/>
+              <w:right w:type="dxa" w:w="120"/>
+            </w:tcMar>
+          </w:tcPr>
+          <w:p>
+            <w:pPr>
+              <w:pStyle w:val="ListParagraph"/>
+              <w:numPr>
+                <w:ilvl w:val="0"/>
+                <w:numId w:val="2"/>
+              </w:numPr>
+              <w:spacing w:after="0" w:line="260" w:lineRule="atLeast"/>
+            </w:pPr>
+            <w:r>
+              <w:rPr>
+                <w:rFonts w:ascii="Arial" w:cs="Arial" w:eastAsia="Arial" w:hAnsi="Arial"/>
+              </w:rPr>
+              <w:t xml:space="preserve">Linear / Notion</w:t>
+            </w:r>
+          </w:p>
+        </w:tc>
+      </w:tr>
+      <w:tr>
+        <w:tc>
+          <w:tcPr>
+            <w:tcW w:type="dxa" w:w="3360"/>
+            <w:tcBorders>
+              <w:top w:val="none" w:color="auto" w:sz="0"/>
+              <w:left w:val="none" w:color="auto" w:sz="0"/>
+              <w:bottom w:val="none" w:color="auto" w:sz="0"/>
+              <w:right w:val="none" w:color="auto" w:sz="0"/>
+            </w:tcBorders>
+            <w:tcMar>
+              <w:top w:type="dxa" w:w="18"/>
+              <w:left w:type="dxa" w:w="0"/>
+              <w:bottom w:type="dxa" w:w="18"/>
+              <w:right w:type="dxa" w:w="120"/>
+            </w:tcMar>
+          </w:tcPr>
+          <w:p>
+            <w:pPr>
+              <w:pStyle w:val="ListParagraph"/>
+              <w:numPr>
+                <w:ilvl w:val="0"/>
+                <w:numId w:val="2"/>
+              </w:numPr>
+              <w:spacing w:after="0" w:line="260" w:lineRule="atLeast"/>
+            </w:pPr>
+            <w:r>
+              <w:rPr>
+                <w:rFonts w:ascii="Arial" w:cs="Arial" w:eastAsia="Arial" w:hAnsi="Arial"/>
+              </w:rPr>
+              <w:t xml:space="preserve">React / Next.js</w:t>
+            </w:r>
+          </w:p>
+        </w:tc>
+        <w:tc>
+          <w:tcPr>
+            <w:tcW w:type="dxa" w:w="3360"/>
+            <w:tcBorders>
+              <w:top w:val="none" w:color="auto" w:sz="0"/>
+              <w:left w:val="none" w:color="auto" w:sz="0"/>
+              <w:bottom w:val="none" w:color="auto" w:sz="0"/>
+              <w:right w:val="none" w:color="auto" w:sz="0"/>
+            </w:tcBorders>
+            <w:tcMar>
+              <w:top w:type="dxa" w:w="18"/>
+              <w:left w:type="dxa" w:w="0"/>
+              <w:bottom w:type="dxa" w:w="18"/>
+              <w:right w:type="dxa" w:w="120"/>
+            </w:tcMar>
+          </w:tcPr>
+          <w:p>
+            <w:pPr>
+              <w:pStyle w:val="ListParagraph"/>
+              <w:numPr>
+                <w:ilvl w:val="0"/>
+                <w:numId w:val="2"/>
+              </w:numPr>
+              <w:spacing w:after="0" w:line="260" w:lineRule="atLeast"/>
+            </w:pPr>
+            <w:r>
+              <w:rPr>
+                <w:rFonts w:ascii="Arial" w:cs="Arial" w:eastAsia="Arial" w:hAnsi="Arial"/>
+              </w:rPr>
+              <w:t xml:space="preserve">Recharts / D3 / OpenMaps</w:t>
+            </w:r>
+          </w:p>
+        </w:tc>
+        <w:tc>
+          <w:tcPr>
+            <w:tcW w:type="dxa" w:w="3360"/>
+            <w:tcBorders>
+              <w:top w:val="none" w:color="auto" w:sz="0"/>
+              <w:left w:val="none" w:color="auto" w:sz="0"/>
+              <w:bottom w:val="none" w:color="auto" w:sz="0"/>
+              <w:right w:val="none" w:color="auto" w:sz="0"/>
+            </w:tcBorders>
+            <w:tcMar>
+              <w:top w:type="dxa" w:w="18"/>
+              <w:left w:type="dxa" w:w="0"/>
+              <w:bottom w:type="dxa" w:w="18"/>
+              <w:right w:type="dxa" w:w="120"/>
+            </w:tcMar>
+          </w:tcPr>
+          <w:p>
+            <w:pPr>
+              <w:pStyle w:val="ListParagraph"/>
+              <w:numPr>
+                <w:ilvl w:val="0"/>
+                <w:numId w:val="2"/>
+              </w:numPr>
+              <w:spacing w:after="0" w:line="260" w:lineRule="atLeast"/>
+            </w:pPr>
+            <w:r>
+              <w:rPr>
+                <w:rFonts w:ascii="Arial" w:cs="Arial" w:eastAsia="Arial" w:hAnsi="Arial"/>
+              </w:rPr>
+              <w:t xml:space="preserve">iOS / Android / VR</w:t>
+            </w:r>
+          </w:p>
+        </w:tc>
+      </w:tr>
+      <w:tr>
+        <w:tc>
+          <w:tcPr>
+            <w:tcW w:type="dxa" w:w="3360"/>
+            <w:tcBorders>
+              <w:top w:val="none" w:color="auto" w:sz="0"/>
+              <w:left w:val="none" w:color="auto" w:sz="0"/>
+              <w:bottom w:val="none" w:color="auto" w:sz="0"/>
+              <w:right w:val="none" w:color="auto" w:sz="0"/>
+            </w:tcBorders>
+            <w:tcMar>
+              <w:top w:type="dxa" w:w="18"/>
+              <w:left w:type="dxa" w:w="0"/>
+              <w:bottom w:type="dxa" w:w="18"/>
+              <w:right w:type="dxa" w:w="120"/>
+            </w:tcMar>
+          </w:tcPr>
+          <w:p>
+            <w:pPr>
+              <w:pStyle w:val="ListParagraph"/>
+              <w:numPr>
+                <w:ilvl w:val="0"/>
+                <w:numId w:val="2"/>
+              </w:numPr>
+              <w:spacing w:after="0" w:line="260" w:lineRule="atLeast"/>
+            </w:pPr>
+            <w:r>
+              <w:rPr>
+                <w:rFonts w:ascii="Arial" w:cs="Arial" w:eastAsia="Arial" w:hAnsi="Arial"/>
+              </w:rPr>
+              <w:t xml:space="preserve">HTML / CSS / Tailwind CSS</w:t>
+            </w:r>
+          </w:p>
+        </w:tc>
+        <w:tc>
+          <w:tcPr>
+            <w:tcW w:type="dxa" w:w="3360"/>
+            <w:tcBorders>
+              <w:top w:val="none" w:color="auto" w:sz="0"/>
+              <w:left w:val="none" w:color="auto" w:sz="0"/>
+              <w:bottom w:val="none" w:color="auto" w:sz="0"/>
+              <w:right w:val="none" w:color="auto" w:sz="0"/>
+            </w:tcBorders>
+            <w:tcMar>
+              <w:top w:type="dxa" w:w="18"/>
+              <w:left w:type="dxa" w:w="0"/>
+              <w:bottom w:type="dxa" w:w="18"/>
+              <w:right w:type="dxa" w:w="120"/>
+            </w:tcMar>
+          </w:tcPr>
+          <w:p>
+            <w:pPr>
+              <w:pStyle w:val="ListParagraph"/>
+              <w:numPr>
+                <w:ilvl w:val="0"/>
+                <w:numId w:val="2"/>
+              </w:numPr>
+              <w:spacing w:after="0" w:line="260" w:lineRule="atLeast"/>
+            </w:pPr>
+            <w:r>
+              <w:rPr>
+                <w:rFonts w:ascii="Arial" w:cs="Arial" w:eastAsia="Arial" w:hAnsi="Arial"/>
+              </w:rPr>
+              <w:t xml:space="preserve">React Flow / Framer Motion</w:t>
+            </w:r>
+          </w:p>
+        </w:tc>
+        <w:tc>
+          <w:tcPr>
+            <w:tcW w:type="dxa" w:w="3360"/>
+            <w:tcBorders>
+              <w:top w:val="none" w:color="auto" w:sz="0"/>
+              <w:left w:val="none" w:color="auto" w:sz="0"/>
+              <w:bottom w:val="none" w:color="auto" w:sz="0"/>
+              <w:right w:val="none" w:color="auto" w:sz="0"/>
+            </w:tcBorders>
+            <w:tcMar>
+              <w:top w:type="dxa" w:w="18"/>
+              <w:left w:type="dxa" w:w="0"/>
+              <w:bottom w:type="dxa" w:w="18"/>
+              <w:right w:type="dxa" w:w="120"/>
+            </w:tcMar>
+          </w:tcPr>
+          <w:p>
+            <w:pPr>
+              <w:pStyle w:val="ListParagraph"/>
+              <w:numPr>
+                <w:ilvl w:val="0"/>
+                <w:numId w:val="2"/>
+              </w:numPr>
+              <w:spacing w:after="0" w:line="260" w:lineRule="atLeast"/>
+            </w:pPr>
+            <w:r>
+              <w:rPr>
+                <w:rFonts w:ascii="Arial" w:cs="Arial" w:eastAsia="Arial" w:hAnsi="Arial"/>
+              </w:rPr>
+              <w:t xml:space="preserve">Framer / Webflow</w:t>
+            </w:r>
+          </w:p>
+        </w:tc>
+      </w:tr>
+      <w:tr>
+        <w:tc>
+          <w:tcPr>
+            <w:tcW w:type="dxa" w:w="3360"/>
+            <w:tcBorders>
+              <w:top w:val="none" w:color="auto" w:sz="0"/>
+              <w:left w:val="none" w:color="auto" w:sz="0"/>
+              <w:bottom w:val="none" w:color="auto" w:sz="0"/>
+              <w:right w:val="none" w:color="auto" w:sz="0"/>
+            </w:tcBorders>
+            <w:tcMar>
+              <w:top w:type="dxa" w:w="18"/>
+              <w:left w:type="dxa" w:w="0"/>
+              <w:bottom w:type="dxa" w:w="18"/>
+              <w:right w:type="dxa" w:w="120"/>
+            </w:tcMar>
+          </w:tcPr>
+          <w:p>
+            <w:pPr>
+              <w:pStyle w:val="ListParagraph"/>
+              <w:numPr>
+                <w:ilvl w:val="0"/>
+                <w:numId w:val="2"/>
+              </w:numPr>
+              <w:spacing w:after="0" w:line="260" w:lineRule="atLeast"/>
+            </w:pPr>
+            <w:r>
+              <w:rPr>
+                <w:rFonts w:ascii="Arial" w:cs="Arial" w:eastAsia="Arial" w:hAnsi="Arial"/>
+              </w:rPr>
+              <w:t xml:space="preserve">JavaScript / TypeScript</w:t>
+            </w:r>
+          </w:p>
+        </w:tc>
+        <w:tc>
+          <w:tcPr>
+            <w:tcW w:type="dxa" w:w="3360"/>
+            <w:tcBorders>
+              <w:top w:val="none" w:color="auto" w:sz="0"/>
+              <w:left w:val="none" w:color="auto" w:sz="0"/>
+              <w:bottom w:val="none" w:color="auto" w:sz="0"/>
+              <w:right w:val="none" w:color="auto" w:sz="0"/>
+            </w:tcBorders>
+            <w:tcMar>
+              <w:top w:type="dxa" w:w="18"/>
+              <w:left w:type="dxa" w:w="0"/>
+              <w:bottom w:type="dxa" w:w="18"/>
+              <w:right w:type="dxa" w:w="120"/>
+            </w:tcMar>
+          </w:tcPr>
+          <w:p>
+            <w:pPr>
+              <w:pStyle w:val="ListParagraph"/>
+              <w:numPr>
+                <w:ilvl w:val="0"/>
+                <w:numId w:val="2"/>
+              </w:numPr>
+              <w:spacing w:after="0" w:line="260" w:lineRule="atLeast"/>
+            </w:pPr>
+            <w:r>
+              <w:rPr>
+                <w:rFonts w:ascii="Arial" w:cs="Arial" w:eastAsia="Arial" w:hAnsi="Arial"/>
+              </w:rPr>
+              <w:t xml:space="preserve">Marketing sites</w:t>
+            </w:r>
+          </w:p>
+        </w:tc>
+        <w:tc>
+          <w:tcPr>
+            <w:tcW w:type="dxa" w:w="3360"/>
+            <w:tcBorders>
+              <w:top w:val="none" w:color="auto" w:sz="0"/>
+              <w:left w:val="none" w:color="auto" w:sz="0"/>
+              <w:bottom w:val="none" w:color="auto" w:sz="0"/>
+              <w:right w:val="none" w:color="auto" w:sz="0"/>
+            </w:tcBorders>
+            <w:tcMar>
+              <w:top w:type="dxa" w:w="18"/>
+              <w:left w:type="dxa" w:w="0"/>
+              <w:bottom w:type="dxa" w:w="18"/>
+              <w:right w:type="dxa" w:w="120"/>
+            </w:tcMar>
+          </w:tcPr>
+          <w:p>
+            <w:pPr>
+              <w:pStyle w:val="ListParagraph"/>
+              <w:numPr>
+                <w:ilvl w:val="0"/>
+                <w:numId w:val="2"/>
+              </w:numPr>
+              <w:spacing w:after="0" w:line="260" w:lineRule="atLeast"/>
+            </w:pPr>
+            <w:r>
+              <w:rPr>
+                <w:rFonts w:ascii="Arial" w:cs="Arial" w:eastAsia="Arial" w:hAnsi="Arial"/>
+              </w:rPr>
+              <w:t xml:space="preserve">Agile / Shape Up / design sprints</w:t>
+            </w:r>
+          </w:p>
+        </w:tc>
+      </w:tr>
+    </w:tbl>
     <w:sectPr>
       <w:pgSz w:w="12240" w:h="15840" w:orient="portrait"/>
       <w:pgMar w:top="936" w:right="1080" w:bottom="936" w:left="1080" w:header="708" w:footer="708" w:gutter="0"/>

</xml_diff>

<commit_message>
Resume Tools & Technologies + footer polish + intro copy (#22)
- New Tools & Technologies section on the resume (web 3×5 category grid;
  matching 3-column layout in the generated PDF and DOCX), rename top
  section to "Skills", tighten Interests/Tools spacing, and the
  "A Beautiful Mess" wording fix.
- Footer: clearer contact-button hover (lift + icon scale, white/40, no
  underline) and full-width divider in the minimal footer.
- Intro: simplify title to "design engineer".

Supersedes #21 (its commits are included here).
</commit_message>
<xml_diff>
--- a/public/dave-keller-resume.docx
+++ b/public/dave-keller-resume.docx
@@ -140,7 +140,7 @@
               </w:rPr>
               <w:t xml:space="preserve">512.595.6213  |  </w:t>
             </w:r>
-            <w:hyperlink w:history="1" r:id="rIdjn8cnldbfpagxdjj88bku">
+            <w:hyperlink w:history="1" r:id="rIdydoxbnqgl8vmjf7o-ozud">
               <w:r>
                 <w:rPr>
                   <w:rFonts w:ascii="Arial" w:cs="Arial" w:eastAsia="Arial" w:hAnsi="Arial"/>
@@ -158,7 +158,7 @@
               <w:br/>
               <w:t xml:space="preserve"/>
             </w:r>
-            <w:hyperlink w:history="1" r:id="rIdv5d6xjtni77f746bcprah">
+            <w:hyperlink w:history="1" r:id="rIdw-1lwtwjv4vgjx6lviqco">
               <w:r>
                 <w:rPr>
                   <w:rFonts w:ascii="Arial" w:cs="Arial" w:eastAsia="Arial" w:hAnsi="Arial"/>
@@ -176,7 +176,7 @@
               <w:br/>
               <w:t xml:space="preserve"/>
             </w:r>
-            <w:hyperlink w:history="1" r:id="rIdbapoweodrz2twpcac6ln6">
+            <w:hyperlink w:history="1" r:id="rIdyxctqa6xvy-bszfywfuge">
               <w:r>
                 <w:rPr>
                   <w:rFonts w:ascii="Arial" w:cs="Arial" w:eastAsia="Arial" w:hAnsi="Arial"/>
@@ -302,7 +302,7 @@
           <w:sz w:val="18"/>
           <w:szCs w:val="18"/>
         </w:rPr>
-        <w:t xml:space="preserve">SKILLS &amp; TOOLS</w:t>
+        <w:t xml:space="preserve">SKILLS</w:t>
       </w:r>
     </w:p>
     <w:p>
@@ -1484,7 +1484,7 @@
         <w:rPr>
           <w:rFonts w:ascii="Arial" w:cs="Arial" w:eastAsia="Arial" w:hAnsi="Arial"/>
         </w:rPr>
-        <w:t xml:space="preserve">Designed and shipped A Beautiful Mess, a photo editor that hit #1 Paid on the App Store and held top-100 for over a year</w:t>
+        <w:t xml:space="preserve">Designed and shipped A Beautiful Mess, a photo editing app that hit #1 Paid on the App Store and held top-100 for over a year</w:t>
       </w:r>
     </w:p>
     <w:p>
@@ -1536,6 +1536,549 @@
         <w:t xml:space="preserve">Guitar and vocals in a rock/metal band · Recording and mixing in Logic Pro · Indoor soccer and racquetball · Mountain biking and endurance sports · International travel (fluent in Spanish) · Adventures with my kids</w:t>
       </w:r>
     </w:p>
+    <w:p>
+      <w:pPr>
+        <w:pBdr>
+          <w:bottom w:val="single" w:color="DDDDDD" w:sz="4" w:space="4"/>
+        </w:pBdr>
+        <w:spacing w:after="120" w:before="320" w:line="260" w:lineRule="atLeast"/>
+      </w:pPr>
+      <w:r>
+        <w:rPr>
+          <w:rFonts w:ascii="Arial" w:cs="Arial" w:eastAsia="Arial" w:hAnsi="Arial"/>
+          <w:b/>
+          <w:bCs/>
+          <w:color w:val="999999"/>
+          <w:spacing w:val="36"/>
+          <w:sz w:val="18"/>
+          <w:szCs w:val="18"/>
+        </w:rPr>
+        <w:t xml:space="preserve">TOOLS &amp; TECHNOLOGIES</w:t>
+      </w:r>
+    </w:p>
+    <w:tbl>
+      <w:tblPr>
+        <w:tblW w:type="dxa" w:w="10080"/>
+        <w:tblBorders>
+          <w:top w:val="none" w:color="auto" w:sz="0"/>
+          <w:left w:val="none" w:color="auto" w:sz="0"/>
+          <w:bottom w:val="none" w:color="auto" w:sz="0"/>
+          <w:right w:val="none" w:color="auto" w:sz="0"/>
+          <w:insideH w:val="none" w:color="auto" w:sz="0"/>
+          <w:insideV w:val="none" w:color="auto" w:sz="0"/>
+        </w:tblBorders>
+      </w:tblPr>
+      <w:tblGrid>
+        <w:gridCol w:w="3360"/>
+        <w:gridCol w:w="3360"/>
+        <w:gridCol w:w="3360"/>
+      </w:tblGrid>
+      <w:tr>
+        <w:tc>
+          <w:tcPr>
+            <w:tcW w:type="dxa" w:w="3360"/>
+            <w:tcBorders>
+              <w:top w:val="none" w:color="auto" w:sz="0"/>
+              <w:left w:val="none" w:color="auto" w:sz="0"/>
+              <w:bottom w:val="none" w:color="auto" w:sz="0"/>
+              <w:right w:val="none" w:color="auto" w:sz="0"/>
+            </w:tcBorders>
+            <w:tcMar>
+              <w:top w:type="dxa" w:w="18"/>
+              <w:left w:type="dxa" w:w="0"/>
+              <w:bottom w:type="dxa" w:w="18"/>
+              <w:right w:type="dxa" w:w="120"/>
+            </w:tcMar>
+          </w:tcPr>
+          <w:p>
+            <w:pPr>
+              <w:pStyle w:val="ListParagraph"/>
+              <w:numPr>
+                <w:ilvl w:val="0"/>
+                <w:numId w:val="2"/>
+              </w:numPr>
+              <w:spacing w:after="0" w:line="260" w:lineRule="atLeast"/>
+            </w:pPr>
+            <w:r>
+              <w:rPr>
+                <w:rFonts w:ascii="Arial" w:cs="Arial" w:eastAsia="Arial" w:hAnsi="Arial"/>
+              </w:rPr>
+              <w:t xml:space="preserve">Figma / Photoshop</w:t>
+            </w:r>
+          </w:p>
+        </w:tc>
+        <w:tc>
+          <w:tcPr>
+            <w:tcW w:type="dxa" w:w="3360"/>
+            <w:tcBorders>
+              <w:top w:val="none" w:color="auto" w:sz="0"/>
+              <w:left w:val="none" w:color="auto" w:sz="0"/>
+              <w:bottom w:val="none" w:color="auto" w:sz="0"/>
+              <w:right w:val="none" w:color="auto" w:sz="0"/>
+            </w:tcBorders>
+            <w:tcMar>
+              <w:top w:type="dxa" w:w="18"/>
+              <w:left w:type="dxa" w:w="0"/>
+              <w:bottom w:type="dxa" w:w="18"/>
+              <w:right w:type="dxa" w:w="120"/>
+            </w:tcMar>
+          </w:tcPr>
+          <w:p>
+            <w:pPr>
+              <w:pStyle w:val="ListParagraph"/>
+              <w:numPr>
+                <w:ilvl w:val="0"/>
+                <w:numId w:val="2"/>
+              </w:numPr>
+              <w:spacing w:after="0" w:line="260" w:lineRule="atLeast"/>
+            </w:pPr>
+            <w:r>
+              <w:rPr>
+                <w:rFonts w:ascii="Arial" w:cs="Arial" w:eastAsia="Arial" w:hAnsi="Arial"/>
+              </w:rPr>
+              <w:t xml:space="preserve">Git / GitHub</w:t>
+            </w:r>
+          </w:p>
+        </w:tc>
+        <w:tc>
+          <w:tcPr>
+            <w:tcW w:type="dxa" w:w="3360"/>
+            <w:tcBorders>
+              <w:top w:val="none" w:color="auto" w:sz="0"/>
+              <w:left w:val="none" w:color="auto" w:sz="0"/>
+              <w:bottom w:val="none" w:color="auto" w:sz="0"/>
+              <w:right w:val="none" w:color="auto" w:sz="0"/>
+            </w:tcBorders>
+            <w:tcMar>
+              <w:top w:type="dxa" w:w="18"/>
+              <w:left w:type="dxa" w:w="0"/>
+              <w:bottom w:type="dxa" w:w="18"/>
+              <w:right w:type="dxa" w:w="120"/>
+            </w:tcMar>
+          </w:tcPr>
+          <w:p>
+            <w:pPr>
+              <w:pStyle w:val="ListParagraph"/>
+              <w:numPr>
+                <w:ilvl w:val="0"/>
+                <w:numId w:val="2"/>
+              </w:numPr>
+              <w:spacing w:after="0" w:line="260" w:lineRule="atLeast"/>
+            </w:pPr>
+            <w:r>
+              <w:rPr>
+                <w:rFonts w:ascii="Arial" w:cs="Arial" w:eastAsia="Arial" w:hAnsi="Arial"/>
+              </w:rPr>
+              <w:t xml:space="preserve">design systems / component libraries</w:t>
+            </w:r>
+          </w:p>
+        </w:tc>
+      </w:tr>
+      <w:tr>
+        <w:tc>
+          <w:tcPr>
+            <w:tcW w:type="dxa" w:w="3360"/>
+            <w:tcBorders>
+              <w:top w:val="none" w:color="auto" w:sz="0"/>
+              <w:left w:val="none" w:color="auto" w:sz="0"/>
+              <w:bottom w:val="none" w:color="auto" w:sz="0"/>
+              <w:right w:val="none" w:color="auto" w:sz="0"/>
+            </w:tcBorders>
+            <w:tcMar>
+              <w:top w:type="dxa" w:w="18"/>
+              <w:left w:type="dxa" w:w="0"/>
+              <w:bottom w:type="dxa" w:w="18"/>
+              <w:right w:type="dxa" w:w="120"/>
+            </w:tcMar>
+          </w:tcPr>
+          <w:p>
+            <w:pPr>
+              <w:pStyle w:val="ListParagraph"/>
+              <w:numPr>
+                <w:ilvl w:val="0"/>
+                <w:numId w:val="2"/>
+              </w:numPr>
+              <w:spacing w:after="0" w:line="260" w:lineRule="atLeast"/>
+            </w:pPr>
+            <w:r>
+              <w:rPr>
+                <w:rFonts w:ascii="Arial" w:cs="Arial" w:eastAsia="Arial" w:hAnsi="Arial"/>
+              </w:rPr>
+              <w:t xml:space="preserve">Claude Code / Codex / Cursor</w:t>
+            </w:r>
+          </w:p>
+        </w:tc>
+        <w:tc>
+          <w:tcPr>
+            <w:tcW w:type="dxa" w:w="3360"/>
+            <w:tcBorders>
+              <w:top w:val="none" w:color="auto" w:sz="0"/>
+              <w:left w:val="none" w:color="auto" w:sz="0"/>
+              <w:bottom w:val="none" w:color="auto" w:sz="0"/>
+              <w:right w:val="none" w:color="auto" w:sz="0"/>
+            </w:tcBorders>
+            <w:tcMar>
+              <w:top w:type="dxa" w:w="18"/>
+              <w:left w:type="dxa" w:w="0"/>
+              <w:bottom w:type="dxa" w:w="18"/>
+              <w:right w:type="dxa" w:w="120"/>
+            </w:tcMar>
+          </w:tcPr>
+          <w:p>
+            <w:pPr>
+              <w:pStyle w:val="ListParagraph"/>
+              <w:numPr>
+                <w:ilvl w:val="0"/>
+                <w:numId w:val="2"/>
+              </w:numPr>
+              <w:spacing w:after="0" w:line="260" w:lineRule="atLeast"/>
+            </w:pPr>
+            <w:r>
+              <w:rPr>
+                <w:rFonts w:ascii="Arial" w:cs="Arial" w:eastAsia="Arial" w:hAnsi="Arial"/>
+              </w:rPr>
+              <w:t xml:space="preserve">Data Viz and Animation libraries</w:t>
+            </w:r>
+          </w:p>
+        </w:tc>
+        <w:tc>
+          <w:tcPr>
+            <w:tcW w:type="dxa" w:w="3360"/>
+            <w:tcBorders>
+              <w:top w:val="none" w:color="auto" w:sz="0"/>
+              <w:left w:val="none" w:color="auto" w:sz="0"/>
+              <w:bottom w:val="none" w:color="auto" w:sz="0"/>
+              <w:right w:val="none" w:color="auto" w:sz="0"/>
+            </w:tcBorders>
+            <w:tcMar>
+              <w:top w:type="dxa" w:w="18"/>
+              <w:left w:type="dxa" w:w="0"/>
+              <w:bottom w:type="dxa" w:w="18"/>
+              <w:right w:type="dxa" w:w="120"/>
+            </w:tcMar>
+          </w:tcPr>
+          <w:p>
+            <w:pPr>
+              <w:pStyle w:val="ListParagraph"/>
+              <w:numPr>
+                <w:ilvl w:val="0"/>
+                <w:numId w:val="2"/>
+              </w:numPr>
+              <w:spacing w:after="0" w:line="260" w:lineRule="atLeast"/>
+            </w:pPr>
+            <w:r>
+              <w:rPr>
+                <w:rFonts w:ascii="Arial" w:cs="Arial" w:eastAsia="Arial" w:hAnsi="Arial"/>
+              </w:rPr>
+              <w:t xml:space="preserve">Linear / Notion</w:t>
+            </w:r>
+          </w:p>
+        </w:tc>
+      </w:tr>
+      <w:tr>
+        <w:tc>
+          <w:tcPr>
+            <w:tcW w:type="dxa" w:w="3360"/>
+            <w:tcBorders>
+              <w:top w:val="none" w:color="auto" w:sz="0"/>
+              <w:left w:val="none" w:color="auto" w:sz="0"/>
+              <w:bottom w:val="none" w:color="auto" w:sz="0"/>
+              <w:right w:val="none" w:color="auto" w:sz="0"/>
+            </w:tcBorders>
+            <w:tcMar>
+              <w:top w:type="dxa" w:w="18"/>
+              <w:left w:type="dxa" w:w="0"/>
+              <w:bottom w:type="dxa" w:w="18"/>
+              <w:right w:type="dxa" w:w="120"/>
+            </w:tcMar>
+          </w:tcPr>
+          <w:p>
+            <w:pPr>
+              <w:pStyle w:val="ListParagraph"/>
+              <w:numPr>
+                <w:ilvl w:val="0"/>
+                <w:numId w:val="2"/>
+              </w:numPr>
+              <w:spacing w:after="0" w:line="260" w:lineRule="atLeast"/>
+            </w:pPr>
+            <w:r>
+              <w:rPr>
+                <w:rFonts w:ascii="Arial" w:cs="Arial" w:eastAsia="Arial" w:hAnsi="Arial"/>
+              </w:rPr>
+              <w:t xml:space="preserve">React / Next.js</w:t>
+            </w:r>
+          </w:p>
+        </w:tc>
+        <w:tc>
+          <w:tcPr>
+            <w:tcW w:type="dxa" w:w="3360"/>
+            <w:tcBorders>
+              <w:top w:val="none" w:color="auto" w:sz="0"/>
+              <w:left w:val="none" w:color="auto" w:sz="0"/>
+              <w:bottom w:val="none" w:color="auto" w:sz="0"/>
+              <w:right w:val="none" w:color="auto" w:sz="0"/>
+            </w:tcBorders>
+            <w:tcMar>
+              <w:top w:type="dxa" w:w="18"/>
+              <w:left w:type="dxa" w:w="0"/>
+              <w:bottom w:type="dxa" w:w="18"/>
+              <w:right w:type="dxa" w:w="120"/>
+            </w:tcMar>
+          </w:tcPr>
+          <w:p>
+            <w:pPr>
+              <w:pStyle w:val="ListParagraph"/>
+              <w:numPr>
+                <w:ilvl w:val="0"/>
+                <w:numId w:val="2"/>
+              </w:numPr>
+              <w:spacing w:after="0" w:line="260" w:lineRule="atLeast"/>
+            </w:pPr>
+            <w:r>
+              <w:rPr>
+                <w:rFonts w:ascii="Arial" w:cs="Arial" w:eastAsia="Arial" w:hAnsi="Arial"/>
+              </w:rPr>
+              <w:t xml:space="preserve">Recharts / D3 / OpenMaps</w:t>
+            </w:r>
+          </w:p>
+        </w:tc>
+        <w:tc>
+          <w:tcPr>
+            <w:tcW w:type="dxa" w:w="3360"/>
+            <w:tcBorders>
+              <w:top w:val="none" w:color="auto" w:sz="0"/>
+              <w:left w:val="none" w:color="auto" w:sz="0"/>
+              <w:bottom w:val="none" w:color="auto" w:sz="0"/>
+              <w:right w:val="none" w:color="auto" w:sz="0"/>
+            </w:tcBorders>
+            <w:tcMar>
+              <w:top w:type="dxa" w:w="18"/>
+              <w:left w:type="dxa" w:w="0"/>
+              <w:bottom w:type="dxa" w:w="18"/>
+              <w:right w:type="dxa" w:w="120"/>
+            </w:tcMar>
+          </w:tcPr>
+          <w:p>
+            <w:pPr>
+              <w:pStyle w:val="ListParagraph"/>
+              <w:numPr>
+                <w:ilvl w:val="0"/>
+                <w:numId w:val="2"/>
+              </w:numPr>
+              <w:spacing w:after="0" w:line="260" w:lineRule="atLeast"/>
+            </w:pPr>
+            <w:r>
+              <w:rPr>
+                <w:rFonts w:ascii="Arial" w:cs="Arial" w:eastAsia="Arial" w:hAnsi="Arial"/>
+              </w:rPr>
+              <w:t xml:space="preserve">iOS / Android / VR</w:t>
+            </w:r>
+          </w:p>
+        </w:tc>
+      </w:tr>
+      <w:tr>
+        <w:tc>
+          <w:tcPr>
+            <w:tcW w:type="dxa" w:w="3360"/>
+            <w:tcBorders>
+              <w:top w:val="none" w:color="auto" w:sz="0"/>
+              <w:left w:val="none" w:color="auto" w:sz="0"/>
+              <w:bottom w:val="none" w:color="auto" w:sz="0"/>
+              <w:right w:val="none" w:color="auto" w:sz="0"/>
+            </w:tcBorders>
+            <w:tcMar>
+              <w:top w:type="dxa" w:w="18"/>
+              <w:left w:type="dxa" w:w="0"/>
+              <w:bottom w:type="dxa" w:w="18"/>
+              <w:right w:type="dxa" w:w="120"/>
+            </w:tcMar>
+          </w:tcPr>
+          <w:p>
+            <w:pPr>
+              <w:pStyle w:val="ListParagraph"/>
+              <w:numPr>
+                <w:ilvl w:val="0"/>
+                <w:numId w:val="2"/>
+              </w:numPr>
+              <w:spacing w:after="0" w:line="260" w:lineRule="atLeast"/>
+            </w:pPr>
+            <w:r>
+              <w:rPr>
+                <w:rFonts w:ascii="Arial" w:cs="Arial" w:eastAsia="Arial" w:hAnsi="Arial"/>
+              </w:rPr>
+              <w:t xml:space="preserve">HTML / CSS / Tailwind CSS</w:t>
+            </w:r>
+          </w:p>
+        </w:tc>
+        <w:tc>
+          <w:tcPr>
+            <w:tcW w:type="dxa" w:w="3360"/>
+            <w:tcBorders>
+              <w:top w:val="none" w:color="auto" w:sz="0"/>
+              <w:left w:val="none" w:color="auto" w:sz="0"/>
+              <w:bottom w:val="none" w:color="auto" w:sz="0"/>
+              <w:right w:val="none" w:color="auto" w:sz="0"/>
+            </w:tcBorders>
+            <w:tcMar>
+              <w:top w:type="dxa" w:w="18"/>
+              <w:left w:type="dxa" w:w="0"/>
+              <w:bottom w:type="dxa" w:w="18"/>
+              <w:right w:type="dxa" w:w="120"/>
+            </w:tcMar>
+          </w:tcPr>
+          <w:p>
+            <w:pPr>
+              <w:pStyle w:val="ListParagraph"/>
+              <w:numPr>
+                <w:ilvl w:val="0"/>
+                <w:numId w:val="2"/>
+              </w:numPr>
+              <w:spacing w:after="0" w:line="260" w:lineRule="atLeast"/>
+            </w:pPr>
+            <w:r>
+              <w:rPr>
+                <w:rFonts w:ascii="Arial" w:cs="Arial" w:eastAsia="Arial" w:hAnsi="Arial"/>
+              </w:rPr>
+              <w:t xml:space="preserve">React Flow / Framer Motion</w:t>
+            </w:r>
+          </w:p>
+        </w:tc>
+        <w:tc>
+          <w:tcPr>
+            <w:tcW w:type="dxa" w:w="3360"/>
+            <w:tcBorders>
+              <w:top w:val="none" w:color="auto" w:sz="0"/>
+              <w:left w:val="none" w:color="auto" w:sz="0"/>
+              <w:bottom w:val="none" w:color="auto" w:sz="0"/>
+              <w:right w:val="none" w:color="auto" w:sz="0"/>
+            </w:tcBorders>
+            <w:tcMar>
+              <w:top w:type="dxa" w:w="18"/>
+              <w:left w:type="dxa" w:w="0"/>
+              <w:bottom w:type="dxa" w:w="18"/>
+              <w:right w:type="dxa" w:w="120"/>
+            </w:tcMar>
+          </w:tcPr>
+          <w:p>
+            <w:pPr>
+              <w:pStyle w:val="ListParagraph"/>
+              <w:numPr>
+                <w:ilvl w:val="0"/>
+                <w:numId w:val="2"/>
+              </w:numPr>
+              <w:spacing w:after="0" w:line="260" w:lineRule="atLeast"/>
+            </w:pPr>
+            <w:r>
+              <w:rPr>
+                <w:rFonts w:ascii="Arial" w:cs="Arial" w:eastAsia="Arial" w:hAnsi="Arial"/>
+              </w:rPr>
+              <w:t xml:space="preserve">Framer / Webflow</w:t>
+            </w:r>
+          </w:p>
+        </w:tc>
+      </w:tr>
+      <w:tr>
+        <w:tc>
+          <w:tcPr>
+            <w:tcW w:type="dxa" w:w="3360"/>
+            <w:tcBorders>
+              <w:top w:val="none" w:color="auto" w:sz="0"/>
+              <w:left w:val="none" w:color="auto" w:sz="0"/>
+              <w:bottom w:val="none" w:color="auto" w:sz="0"/>
+              <w:right w:val="none" w:color="auto" w:sz="0"/>
+            </w:tcBorders>
+            <w:tcMar>
+              <w:top w:type="dxa" w:w="18"/>
+              <w:left w:type="dxa" w:w="0"/>
+              <w:bottom w:type="dxa" w:w="18"/>
+              <w:right w:type="dxa" w:w="120"/>
+            </w:tcMar>
+          </w:tcPr>
+          <w:p>
+            <w:pPr>
+              <w:pStyle w:val="ListParagraph"/>
+              <w:numPr>
+                <w:ilvl w:val="0"/>
+                <w:numId w:val="2"/>
+              </w:numPr>
+              <w:spacing w:after="0" w:line="260" w:lineRule="atLeast"/>
+            </w:pPr>
+            <w:r>
+              <w:rPr>
+                <w:rFonts w:ascii="Arial" w:cs="Arial" w:eastAsia="Arial" w:hAnsi="Arial"/>
+              </w:rPr>
+              <w:t xml:space="preserve">JavaScript / TypeScript</w:t>
+            </w:r>
+          </w:p>
+        </w:tc>
+        <w:tc>
+          <w:tcPr>
+            <w:tcW w:type="dxa" w:w="3360"/>
+            <w:tcBorders>
+              <w:top w:val="none" w:color="auto" w:sz="0"/>
+              <w:left w:val="none" w:color="auto" w:sz="0"/>
+              <w:bottom w:val="none" w:color="auto" w:sz="0"/>
+              <w:right w:val="none" w:color="auto" w:sz="0"/>
+            </w:tcBorders>
+            <w:tcMar>
+              <w:top w:type="dxa" w:w="18"/>
+              <w:left w:type="dxa" w:w="0"/>
+              <w:bottom w:type="dxa" w:w="18"/>
+              <w:right w:type="dxa" w:w="120"/>
+            </w:tcMar>
+          </w:tcPr>
+          <w:p>
+            <w:pPr>
+              <w:pStyle w:val="ListParagraph"/>
+              <w:numPr>
+                <w:ilvl w:val="0"/>
+                <w:numId w:val="2"/>
+              </w:numPr>
+              <w:spacing w:after="0" w:line="260" w:lineRule="atLeast"/>
+            </w:pPr>
+            <w:r>
+              <w:rPr>
+                <w:rFonts w:ascii="Arial" w:cs="Arial" w:eastAsia="Arial" w:hAnsi="Arial"/>
+              </w:rPr>
+              <w:t xml:space="preserve">Marketing sites</w:t>
+            </w:r>
+          </w:p>
+        </w:tc>
+        <w:tc>
+          <w:tcPr>
+            <w:tcW w:type="dxa" w:w="3360"/>
+            <w:tcBorders>
+              <w:top w:val="none" w:color="auto" w:sz="0"/>
+              <w:left w:val="none" w:color="auto" w:sz="0"/>
+              <w:bottom w:val="none" w:color="auto" w:sz="0"/>
+              <w:right w:val="none" w:color="auto" w:sz="0"/>
+            </w:tcBorders>
+            <w:tcMar>
+              <w:top w:type="dxa" w:w="18"/>
+              <w:left w:type="dxa" w:w="0"/>
+              <w:bottom w:type="dxa" w:w="18"/>
+              <w:right w:type="dxa" w:w="120"/>
+            </w:tcMar>
+          </w:tcPr>
+          <w:p>
+            <w:pPr>
+              <w:pStyle w:val="ListParagraph"/>
+              <w:numPr>
+                <w:ilvl w:val="0"/>
+                <w:numId w:val="2"/>
+              </w:numPr>
+              <w:spacing w:after="0" w:line="260" w:lineRule="atLeast"/>
+            </w:pPr>
+            <w:r>
+              <w:rPr>
+                <w:rFonts w:ascii="Arial" w:cs="Arial" w:eastAsia="Arial" w:hAnsi="Arial"/>
+              </w:rPr>
+              <w:t xml:space="preserve">Agile / Shape Up / design sprints</w:t>
+            </w:r>
+          </w:p>
+        </w:tc>
+      </w:tr>
+    </w:tbl>
     <w:sectPr>
       <w:pgSz w:w="12240" w:h="15840" w:orient="portrait"/>
       <w:pgMar w:top="936" w:right="1080" w:bottom="936" w:left="1080" w:header="708" w:footer="708" w:gutter="0"/>

</xml_diff>

<commit_message>
Resume: summary line + tighter 5-bullet highlights + interests refresh
- Add a positioning summary under the header (page, PDF, DOCX)
- Rewrite Highlights as 5 tighter bullets: 15+ yrs 0→1 through 2.0/GTM;
  pixel-perfect designer who ships in code; process builder & systems
  architect; track record; founder & client services (Warner Bros)
- Interests: add "Video editing in Final Cut Pro" and "Mountain biking and
  dirt bike racing"; reorder columns; drop "Adventures with my kids"
- README: refresh one-line description to match positioning
- Regenerate dave-keller-resume.pdf / .docx from the updated scripts

Co-Authored-By: Claude Opus 4.8 <noreply@anthropic.com>
</commit_message>
<xml_diff>
--- a/public/dave-keller-resume.docx
+++ b/public/dave-keller-resume.docx
@@ -140,7 +140,7 @@
               </w:rPr>
               <w:t xml:space="preserve">512.595.6213  |  </w:t>
             </w:r>
-            <w:hyperlink w:history="1" r:id="rIdydoxbnqgl8vmjf7o-ozud">
+            <w:hyperlink w:history="1" r:id="rId0a5-uhu_gd7zuizbk9ygc">
               <w:r>
                 <w:rPr>
                   <w:rFonts w:ascii="Arial" w:cs="Arial" w:eastAsia="Arial" w:hAnsi="Arial"/>
@@ -158,7 +158,7 @@
               <w:br/>
               <w:t xml:space="preserve"/>
             </w:r>
-            <w:hyperlink w:history="1" r:id="rIdw-1lwtwjv4vgjx6lviqco">
+            <w:hyperlink w:history="1" r:id="rId-jubgwc3svpqbyw6rpkax">
               <w:r>
                 <w:rPr>
                   <w:rFonts w:ascii="Arial" w:cs="Arial" w:eastAsia="Arial" w:hAnsi="Arial"/>
@@ -176,7 +176,7 @@
               <w:br/>
               <w:t xml:space="preserve"/>
             </w:r>
-            <w:hyperlink w:history="1" r:id="rIdyxctqa6xvy-bszfywfuge">
+            <w:hyperlink w:history="1" r:id="rIdujnjnmtxebflj1-y9hrak">
               <w:r>
                 <w:rPr>
                   <w:rFonts w:ascii="Arial" w:cs="Arial" w:eastAsia="Arial" w:hAnsi="Arial"/>
@@ -195,6 +195,17 @@
     </w:tbl>
     <w:p>
       <w:pPr>
+        <w:spacing w:after="80" w:line="260" w:lineRule="atLeast"/>
+      </w:pPr>
+      <w:r>
+        <w:rPr>
+          <w:rFonts w:ascii="Arial" w:cs="Arial" w:eastAsia="Arial" w:hAnsi="Arial"/>
+        </w:rPr>
+        <w:t xml:space="preserve">Strategic product thinker, Figma expert, and design/front-end engineer. I was writing front-end before agentic coding — now primarily designing in the browser with Claude Code/Codex and Tailwind, shipping both functional prototypes and production code.</w:t>
+      </w:r>
+    </w:p>
+    <w:p>
+      <w:pPr>
         <w:pBdr>
           <w:bottom w:val="single" w:color="DDDDDD" w:sz="4" w:space="4"/>
         </w:pBdr>
@@ -228,7 +239,7 @@
         <w:rPr>
           <w:rFonts w:ascii="Arial" w:cs="Arial" w:eastAsia="Arial" w:hAnsi="Arial"/>
         </w:rPr>
-        <w:t xml:space="preserve">15+ years leading design on dev/product teams at early-seed startups, often 0 to 1, with experience across industries — AI, data science, entertainment, messaging, ecommerce, fintech and more</w:t>
+        <w:t xml:space="preserve">15+ years leading design at early-stage startups — from 0 to 1 through 2.0 and GTM. Across AI, data science, entertainment, messaging, ecommerce, and fintech.</w:t>
       </w:r>
     </w:p>
     <w:p>
@@ -246,7 +257,7 @@
         <w:rPr>
           <w:rFonts w:ascii="Arial" w:cs="Arial" w:eastAsia="Arial" w:hAnsi="Arial"/>
         </w:rPr>
-        <w:t xml:space="preserve">Strategic product thinker, Figma expert, and front-end dev (HTML/CSS, Tailwind, Claude Code). Experienced in validating ideas with design sprints, prototyping end-to-end flows, and refining production UIs in code</w:t>
+        <w:t xml:space="preserve">A pixel-perfect designer who ships in code. Sweating the visual details — prototyping end-to-end flows and refining high-fidelity production UIs directly in the front-end.</w:t>
       </w:r>
     </w:p>
     <w:p>
@@ -264,7 +275,7 @@
         <w:rPr>
           <w:rFonts w:ascii="Arial" w:cs="Arial" w:eastAsia="Arial" w:hAnsi="Arial"/>
         </w:rPr>
-        <w:t xml:space="preserve">Fluent in agile/sprint workflows and in building process for product teams. Helped create a 'Shape Up' process that organized a ~45-developer company into four product teams, building cross-functionally and shipping consistently on a staggered cadence</w:t>
+        <w:t xml:space="preserve">Process builder and systems architect. Architected multi-platform design systems. Built a process that organized a ~45-developer company into four cross-functional teams shipping on a steady cadence.</w:t>
       </w:r>
     </w:p>
     <w:p>
@@ -282,7 +293,25 @@
         <w:rPr>
           <w:rFonts w:ascii="Arial" w:cs="Arial" w:eastAsia="Arial" w:hAnsi="Arial"/>
         </w:rPr>
-        <w:t xml:space="preserve">Shipped 40+ products across web, iOS, and Android — including a #1 Paid iPhone app and a platform that grossed $33M in year one. Co-founded a 20-person agency and a messaging app that raised $3M</w:t>
+        <w:t xml:space="preserve">Track record. 40+ products across web, iOS, and Android — including a #1 Paid iPhone app and a platform that grossed $33M in year one.</w:t>
+      </w:r>
+    </w:p>
+    <w:p>
+      <w:pPr>
+        <w:pStyle w:val="ListParagraph"/>
+        <w:keepNext w:val="false"/>
+        <w:keepLines/>
+        <w:numPr>
+          <w:ilvl w:val="0"/>
+          <w:numId w:val="2"/>
+        </w:numPr>
+        <w:spacing w:after="140" w:line="260" w:lineRule="atLeast"/>
+      </w:pPr>
+      <w:r>
+        <w:rPr>
+          <w:rFonts w:ascii="Arial" w:cs="Arial" w:eastAsia="Arial" w:hAnsi="Arial"/>
+        </w:rPr>
+        <w:t xml:space="preserve">Founder &amp; client services. Co-founded a 20-person design/dev agency and a $3M-funded messaging app. The agency became a concepting and prototyping shop for Warner Bros — with work for Ellen, DreamWorks, and The Economist along the way.</w:t>
       </w:r>
     </w:p>
     <w:p>
@@ -1533,7 +1562,7 @@
         <w:rPr>
           <w:rFonts w:ascii="Arial" w:cs="Arial" w:eastAsia="Arial" w:hAnsi="Arial"/>
         </w:rPr>
-        <w:t xml:space="preserve">Guitar and vocals in a rock/metal band · Recording and mixing in Logic Pro · Indoor soccer and racquetball · Mountain biking and endurance sports · International travel (fluent in Spanish) · Adventures with my kids</w:t>
+        <w:t xml:space="preserve">Guitar and vocals in a rock/metal band · Recording and mixing in Logic Pro · Mountain biking and dirt bike racing · Video editing in Final Cut Pro · Indoor soccer and racquetball · International travel (fluent in Spanish)</w:t>
       </w:r>
     </w:p>
     <w:p>

</xml_diff>

<commit_message>
Resume: reclaim 2-page PDF + drop remaining Shape Up mentions
- Tighten PDF spacing (leading 13→12.5; section/job/top gaps) to fit 2 pages
- Drop "Shape Up" from the QuotaPath bullet (→ "product-development
  process") and the Tools list (→ "Agile / design sprints")
- Regenerate PDF (now 2 pages) + DOCX

Co-Authored-By: Claude Opus 4.8 <noreply@anthropic.com>
</commit_message>
<xml_diff>
--- a/public/dave-keller-resume.docx
+++ b/public/dave-keller-resume.docx
@@ -140,7 +140,7 @@
               </w:rPr>
               <w:t xml:space="preserve">512.595.6213  |  </w:t>
             </w:r>
-            <w:hyperlink w:history="1" r:id="rId0a5-uhu_gd7zuizbk9ygc">
+            <w:hyperlink w:history="1" r:id="rIdfkygs_x1mapariw2lcvu_">
               <w:r>
                 <w:rPr>
                   <w:rFonts w:ascii="Arial" w:cs="Arial" w:eastAsia="Arial" w:hAnsi="Arial"/>
@@ -158,7 +158,7 @@
               <w:br/>
               <w:t xml:space="preserve"/>
             </w:r>
-            <w:hyperlink w:history="1" r:id="rId-jubgwc3svpqbyw6rpkax">
+            <w:hyperlink w:history="1" r:id="rIdhakilrcccgp82m467mp-i">
               <w:r>
                 <w:rPr>
                   <w:rFonts w:ascii="Arial" w:cs="Arial" w:eastAsia="Arial" w:hAnsi="Arial"/>
@@ -176,7 +176,7 @@
               <w:br/>
               <w:t xml:space="preserve"/>
             </w:r>
-            <w:hyperlink w:history="1" r:id="rIdujnjnmtxebflj1-y9hrak">
+            <w:hyperlink w:history="1" r:id="rIdhgemoygwfvtoyrcpnjuji">
               <w:r>
                 <w:rPr>
                   <w:rFonts w:ascii="Arial" w:cs="Arial" w:eastAsia="Arial" w:hAnsi="Arial"/>
@@ -761,7 +761,7 @@
         <w:rPr>
           <w:rFonts w:ascii="Arial" w:cs="Arial" w:eastAsia="Arial" w:hAnsi="Arial"/>
         </w:rPr>
-        <w:t xml:space="preserve">Co-created the Shape Up process across 4 cross-functional teams and mentored the designers running it</w:t>
+        <w:t xml:space="preserve">Co-created a product-development process across 4 cross-functional teams and mentored the designers running it</w:t>
       </w:r>
     </w:p>
     <w:p>
@@ -2102,7 +2102,7 @@
               <w:rPr>
                 <w:rFonts w:ascii="Arial" w:cs="Arial" w:eastAsia="Arial" w:hAnsi="Arial"/>
               </w:rPr>
-              <w:t xml:space="preserve">Agile / Shape Up / design sprints</w:t>
+              <w:t xml:space="preserve">Agile / design sprints</w:t>
             </w:r>
           </w:p>
         </w:tc>

</xml_diff>

<commit_message>
Resume PDF/DOCX: drop summary blurb, open spacing to fill 2 pages
- Remove the top summary from the printed PDF + DOCX (start at Highlights).
  The web résumé page keeps the summary.
- Retune PDF spacing (leading 12.5; section/job/bullet gaps) to fill two
  pages without spilling to a third
- Regenerate PDF (2 pages) + DOCX

Co-Authored-By: Claude Opus 4.8 <noreply@anthropic.com>
</commit_message>
<xml_diff>
--- a/public/dave-keller-resume.docx
+++ b/public/dave-keller-resume.docx
@@ -140,7 +140,7 @@
               </w:rPr>
               <w:t xml:space="preserve">512.595.6213  |  </w:t>
             </w:r>
-            <w:hyperlink w:history="1" r:id="rIdfkygs_x1mapariw2lcvu_">
+            <w:hyperlink w:history="1" r:id="rIdkx2z40pnuvijlg-rykper">
               <w:r>
                 <w:rPr>
                   <w:rFonts w:ascii="Arial" w:cs="Arial" w:eastAsia="Arial" w:hAnsi="Arial"/>
@@ -158,7 +158,7 @@
               <w:br/>
               <w:t xml:space="preserve"/>
             </w:r>
-            <w:hyperlink w:history="1" r:id="rIdhakilrcccgp82m467mp-i">
+            <w:hyperlink w:history="1" r:id="rIdhuwrnh_sxhnstqazr065r">
               <w:r>
                 <w:rPr>
                   <w:rFonts w:ascii="Arial" w:cs="Arial" w:eastAsia="Arial" w:hAnsi="Arial"/>
@@ -176,7 +176,7 @@
               <w:br/>
               <w:t xml:space="preserve"/>
             </w:r>
-            <w:hyperlink w:history="1" r:id="rIdhgemoygwfvtoyrcpnjuji">
+            <w:hyperlink w:history="1" r:id="rIdifzvsz6tsr6dj1tw-7opl">
               <w:r>
                 <w:rPr>
                   <w:rFonts w:ascii="Arial" w:cs="Arial" w:eastAsia="Arial" w:hAnsi="Arial"/>
@@ -193,17 +193,6 @@
         </w:tc>
       </w:tr>
     </w:tbl>
-    <w:p>
-      <w:pPr>
-        <w:spacing w:after="80" w:line="260" w:lineRule="atLeast"/>
-      </w:pPr>
-      <w:r>
-        <w:rPr>
-          <w:rFonts w:ascii="Arial" w:cs="Arial" w:eastAsia="Arial" w:hAnsi="Arial"/>
-        </w:rPr>
-        <w:t xml:space="preserve">Strategic product thinker, Figma expert, and design/front-end engineer. I was writing front-end before agentic coding — now primarily designing in the browser with Claude Code/Codex and Tailwind, shipping both functional prototypes and production code.</w:t>
-      </w:r>
-    </w:p>
     <w:p>
       <w:pPr>
         <w:pBdr>

</xml_diff>

<commit_message>
Resume contact block: reorder + label the portfolio
- Reorder to: phone | email · LinkedIn · Portfolio: kidastro (printed
  PDF + DOCX). Web résumé omits the Portfolio line (the page is the
  portfolio) but keeps the same order/formatting.
- Label the portfolio link "Portfolio: kidastro" for clarity
- Regenerate PDF (still 2 pages) + DOCX

Co-Authored-By: Claude Opus 4.8 <noreply@anthropic.com>
</commit_message>
<xml_diff>
--- a/public/dave-keller-resume.docx
+++ b/public/dave-keller-resume.docx
@@ -140,7 +140,25 @@
               </w:rPr>
               <w:t xml:space="preserve">512.595.6213  |  </w:t>
             </w:r>
-            <w:hyperlink w:history="1" r:id="rIdkx2z40pnuvijlg-rykper">
+            <w:hyperlink w:history="1" r:id="rIduvffpvlg4yisglaexhowg">
+              <w:r>
+                <w:rPr>
+                  <w:rFonts w:ascii="Arial" w:cs="Arial" w:eastAsia="Arial" w:hAnsi="Arial"/>
+                  <w:color w:val="555555"/>
+                  <w:sz w:val="18"/>
+                  <w:szCs w:val="18"/>
+                </w:rPr>
+                <w:t xml:space="preserve">davekeller@me.com</w:t>
+              </w:r>
+            </w:hyperlink>
+            <w:r>
+              <w:rPr>
+                <w:rFonts w:ascii="Arial" w:cs="Arial" w:eastAsia="Arial" w:hAnsi="Arial"/>
+              </w:rPr>
+              <w:br/>
+              <w:t xml:space="preserve"/>
+            </w:r>
+            <w:hyperlink w:history="1" r:id="rIdfvh8ltjlufrujiwvcpkq7">
               <w:r>
                 <w:rPr>
                   <w:rFonts w:ascii="Arial" w:cs="Arial" w:eastAsia="Arial" w:hAnsi="Arial"/>
@@ -158,25 +176,16 @@
               <w:br/>
               <w:t xml:space="preserve"/>
             </w:r>
-            <w:hyperlink w:history="1" r:id="rIdhuwrnh_sxhnstqazr065r">
-              <w:r>
-                <w:rPr>
-                  <w:rFonts w:ascii="Arial" w:cs="Arial" w:eastAsia="Arial" w:hAnsi="Arial"/>
-                  <w:color w:val="555555"/>
-                  <w:sz w:val="18"/>
-                  <w:szCs w:val="18"/>
-                </w:rPr>
-                <w:t xml:space="preserve">davekeller@me.com</w:t>
-              </w:r>
-            </w:hyperlink>
-            <w:r>
-              <w:rPr>
-                <w:rFonts w:ascii="Arial" w:cs="Arial" w:eastAsia="Arial" w:hAnsi="Arial"/>
-              </w:rPr>
-              <w:br/>
-              <w:t xml:space="preserve"/>
-            </w:r>
-            <w:hyperlink w:history="1" r:id="rIdifzvsz6tsr6dj1tw-7opl">
+            <w:r>
+              <w:rPr>
+                <w:rFonts w:ascii="Arial" w:cs="Arial" w:eastAsia="Arial" w:hAnsi="Arial"/>
+                <w:color w:val="555555"/>
+                <w:sz w:val="18"/>
+                <w:szCs w:val="18"/>
+              </w:rPr>
+              <w:t xml:space="preserve">Portfolio: </w:t>
+            </w:r>
+            <w:hyperlink w:history="1" r:id="rIdvxgcuxjdapv7pexhocgo9">
               <w:r>
                 <w:rPr>
                   <w:rFonts w:ascii="Arial" w:cs="Arial" w:eastAsia="Arial" w:hAnsi="Arial"/>
@@ -186,7 +195,7 @@
                   <w:sz w:val="18"/>
                   <w:szCs w:val="18"/>
                 </w:rPr>
-                <w:t xml:space="preserve">kidastro.com</w:t>
+                <w:t xml:space="preserve">kidastro</w:t>
               </w:r>
             </w:hyperlink>
           </w:p>

</xml_diff>

<commit_message>
Resume contact: web 3 lines (email/phone/LinkedIn), print 2 lines
- Web résumé: email · phone · LinkedIn, each on its own line
- PDF/DOCX: two lines — "512.595.6213 | davekeller@me.com" and
  "Portfolio: kidastro | linkedin/dkells"
- Regenerate PDF (2 pages) + DOCX

Co-Authored-By: Claude Opus 4.8 <noreply@anthropic.com>
</commit_message>
<xml_diff>
--- a/public/dave-keller-resume.docx
+++ b/public/dave-keller-resume.docx
@@ -140,7 +140,7 @@
               </w:rPr>
               <w:t xml:space="preserve">512.595.6213  |  </w:t>
             </w:r>
-            <w:hyperlink w:history="1" r:id="rIduvffpvlg4yisglaexhowg">
+            <w:hyperlink w:history="1" r:id="rIdylvbtuypewczxl7as2txu">
               <w:r>
                 <w:rPr>
                   <w:rFonts w:ascii="Arial" w:cs="Arial" w:eastAsia="Arial" w:hAnsi="Arial"/>
@@ -158,24 +158,6 @@
               <w:br/>
               <w:t xml:space="preserve"/>
             </w:r>
-            <w:hyperlink w:history="1" r:id="rIdfvh8ltjlufrujiwvcpkq7">
-              <w:r>
-                <w:rPr>
-                  <w:rFonts w:ascii="Arial" w:cs="Arial" w:eastAsia="Arial" w:hAnsi="Arial"/>
-                  <w:color w:val="555555"/>
-                  <w:sz w:val="18"/>
-                  <w:szCs w:val="18"/>
-                </w:rPr>
-                <w:t xml:space="preserve">linkedin/dkells</w:t>
-              </w:r>
-            </w:hyperlink>
-            <w:r>
-              <w:rPr>
-                <w:rFonts w:ascii="Arial" w:cs="Arial" w:eastAsia="Arial" w:hAnsi="Arial"/>
-              </w:rPr>
-              <w:br/>
-              <w:t xml:space="preserve"/>
-            </w:r>
             <w:r>
               <w:rPr>
                 <w:rFonts w:ascii="Arial" w:cs="Arial" w:eastAsia="Arial" w:hAnsi="Arial"/>
@@ -185,7 +167,7 @@
               </w:rPr>
               <w:t xml:space="preserve">Portfolio: </w:t>
             </w:r>
-            <w:hyperlink w:history="1" r:id="rIdvxgcuxjdapv7pexhocgo9">
+            <w:hyperlink w:history="1" r:id="rIdh93o9htby7nviymfnpm9o">
               <w:r>
                 <w:rPr>
                   <w:rFonts w:ascii="Arial" w:cs="Arial" w:eastAsia="Arial" w:hAnsi="Arial"/>
@@ -196,6 +178,26 @@
                   <w:szCs w:val="18"/>
                 </w:rPr>
                 <w:t xml:space="preserve">kidastro</w:t>
+              </w:r>
+            </w:hyperlink>
+            <w:r>
+              <w:rPr>
+                <w:rFonts w:ascii="Arial" w:cs="Arial" w:eastAsia="Arial" w:hAnsi="Arial"/>
+                <w:color w:val="555555"/>
+                <w:sz w:val="18"/>
+                <w:szCs w:val="18"/>
+              </w:rPr>
+              <w:t xml:space="preserve">  |  </w:t>
+            </w:r>
+            <w:hyperlink w:history="1" r:id="rIdl1_klmlbvrmxwarhct4qv">
+              <w:r>
+                <w:rPr>
+                  <w:rFonts w:ascii="Arial" w:cs="Arial" w:eastAsia="Arial" w:hAnsi="Arial"/>
+                  <w:color w:val="555555"/>
+                  <w:sz w:val="18"/>
+                  <w:szCs w:val="18"/>
+                </w:rPr>
+                <w:t xml:space="preserve">linkedin/dkells</w:t>
               </w:r>
             </w:hyperlink>
           </w:p>

</xml_diff>

<commit_message>
Resume print contact: portfolio line on top + full kidastro.com
- PDF/DOCX contact now leads with "Portfolio: kidastro.com | linkedin/dkells",
  then "512.595.6213 | davekeller@me.com"
- Portfolio link displays the full "kidastro.com"
- Regenerate PDF (2 pages) + DOCX

Co-Authored-By: Claude Opus 4.8 <noreply@anthropic.com>
</commit_message>
<xml_diff>
--- a/public/dave-keller-resume.docx
+++ b/public/dave-keller-resume.docx
@@ -138,36 +138,9 @@
                 <w:sz w:val="18"/>
                 <w:szCs w:val="18"/>
               </w:rPr>
-              <w:t xml:space="preserve">512.595.6213  |  </w:t>
-            </w:r>
-            <w:hyperlink w:history="1" r:id="rIdylvbtuypewczxl7as2txu">
-              <w:r>
-                <w:rPr>
-                  <w:rFonts w:ascii="Arial" w:cs="Arial" w:eastAsia="Arial" w:hAnsi="Arial"/>
-                  <w:color w:val="555555"/>
-                  <w:sz w:val="18"/>
-                  <w:szCs w:val="18"/>
-                </w:rPr>
-                <w:t xml:space="preserve">davekeller@me.com</w:t>
-              </w:r>
-            </w:hyperlink>
-            <w:r>
-              <w:rPr>
-                <w:rFonts w:ascii="Arial" w:cs="Arial" w:eastAsia="Arial" w:hAnsi="Arial"/>
-              </w:rPr>
-              <w:br/>
-              <w:t xml:space="preserve"/>
-            </w:r>
-            <w:r>
-              <w:rPr>
-                <w:rFonts w:ascii="Arial" w:cs="Arial" w:eastAsia="Arial" w:hAnsi="Arial"/>
-                <w:color w:val="555555"/>
-                <w:sz w:val="18"/>
-                <w:szCs w:val="18"/>
-              </w:rPr>
               <w:t xml:space="preserve">Portfolio: </w:t>
             </w:r>
-            <w:hyperlink w:history="1" r:id="rIdh93o9htby7nviymfnpm9o">
+            <w:hyperlink w:history="1" r:id="rIdsgkw7btho17xlyl8qb4h3">
               <w:r>
                 <w:rPr>
                   <w:rFonts w:ascii="Arial" w:cs="Arial" w:eastAsia="Arial" w:hAnsi="Arial"/>
@@ -177,7 +150,7 @@
                   <w:sz w:val="18"/>
                   <w:szCs w:val="18"/>
                 </w:rPr>
-                <w:t xml:space="preserve">kidastro</w:t>
+                <w:t xml:space="preserve">kidastro.com</w:t>
               </w:r>
             </w:hyperlink>
             <w:r>
@@ -189,7 +162,7 @@
               </w:rPr>
               <w:t xml:space="preserve">  |  </w:t>
             </w:r>
-            <w:hyperlink w:history="1" r:id="rIdl1_klmlbvrmxwarhct4qv">
+            <w:hyperlink w:history="1" r:id="rIdiel1s8kvr-lhnvz-cjb0c">
               <w:r>
                 <w:rPr>
                   <w:rFonts w:ascii="Arial" w:cs="Arial" w:eastAsia="Arial" w:hAnsi="Arial"/>
@@ -198,6 +171,33 @@
                   <w:szCs w:val="18"/>
                 </w:rPr>
                 <w:t xml:space="preserve">linkedin/dkells</w:t>
+              </w:r>
+            </w:hyperlink>
+            <w:r>
+              <w:rPr>
+                <w:rFonts w:ascii="Arial" w:cs="Arial" w:eastAsia="Arial" w:hAnsi="Arial"/>
+              </w:rPr>
+              <w:br/>
+              <w:t xml:space="preserve"/>
+            </w:r>
+            <w:r>
+              <w:rPr>
+                <w:rFonts w:ascii="Arial" w:cs="Arial" w:eastAsia="Arial" w:hAnsi="Arial"/>
+                <w:color w:val="555555"/>
+                <w:sz w:val="18"/>
+                <w:szCs w:val="18"/>
+              </w:rPr>
+              <w:t xml:space="preserve">512.595.6213  |  </w:t>
+            </w:r>
+            <w:hyperlink w:history="1" r:id="rIdszzis0ptftlffof9gbbtm">
+              <w:r>
+                <w:rPr>
+                  <w:rFonts w:ascii="Arial" w:cs="Arial" w:eastAsia="Arial" w:hAnsi="Arial"/>
+                  <w:color w:val="555555"/>
+                  <w:sz w:val="18"/>
+                  <w:szCs w:val="18"/>
+                </w:rPr>
+                <w:t xml:space="preserve">davekeller@me.com</w:t>
               </w:r>
             </w:hyperlink>
           </w:p>

</xml_diff>

<commit_message>
Resume: refresh highlights/summary/interests + reworked 2-page print contact (#26)
Squash of the résumé refresh (web page + generated PDF/DOCX + README):
- Summary line on the web résumé; printed PDF/DOCX open at Highlights
- 5 tighter highlights; interests updated (Final Cut Pro, dirt bike racing)
- Dropped "Shape Up" mentions
- 2-page PDF with spacing tuned to fill both pages
- Contact block: web = email/phone/LinkedIn; print = "Portfolio: kidastro.com | linkedin/dkells" then "512.595.6213 | davekeller@me.com"
</commit_message>
<xml_diff>
--- a/public/dave-keller-resume.docx
+++ b/public/dave-keller-resume.docx
@@ -138,45 +138,9 @@
                 <w:sz w:val="18"/>
                 <w:szCs w:val="18"/>
               </w:rPr>
-              <w:t xml:space="preserve">512.595.6213  |  </w:t>
-            </w:r>
-            <w:hyperlink w:history="1" r:id="rIdydoxbnqgl8vmjf7o-ozud">
-              <w:r>
-                <w:rPr>
-                  <w:rFonts w:ascii="Arial" w:cs="Arial" w:eastAsia="Arial" w:hAnsi="Arial"/>
-                  <w:color w:val="555555"/>
-                  <w:sz w:val="18"/>
-                  <w:szCs w:val="18"/>
-                </w:rPr>
-                <w:t xml:space="preserve">linkedin/dkells</w:t>
-              </w:r>
-            </w:hyperlink>
-            <w:r>
-              <w:rPr>
-                <w:rFonts w:ascii="Arial" w:cs="Arial" w:eastAsia="Arial" w:hAnsi="Arial"/>
-              </w:rPr>
-              <w:br/>
-              <w:t xml:space="preserve"/>
-            </w:r>
-            <w:hyperlink w:history="1" r:id="rIdw-1lwtwjv4vgjx6lviqco">
-              <w:r>
-                <w:rPr>
-                  <w:rFonts w:ascii="Arial" w:cs="Arial" w:eastAsia="Arial" w:hAnsi="Arial"/>
-                  <w:color w:val="555555"/>
-                  <w:sz w:val="18"/>
-                  <w:szCs w:val="18"/>
-                </w:rPr>
-                <w:t xml:space="preserve">davekeller@me.com</w:t>
-              </w:r>
-            </w:hyperlink>
-            <w:r>
-              <w:rPr>
-                <w:rFonts w:ascii="Arial" w:cs="Arial" w:eastAsia="Arial" w:hAnsi="Arial"/>
-              </w:rPr>
-              <w:br/>
-              <w:t xml:space="preserve"/>
-            </w:r>
-            <w:hyperlink w:history="1" r:id="rIdyxctqa6xvy-bszfywfuge">
+              <w:t xml:space="preserve">Portfolio: </w:t>
+            </w:r>
+            <w:hyperlink w:history="1" r:id="rIdsgkw7btho17xlyl8qb4h3">
               <w:r>
                 <w:rPr>
                   <w:rFonts w:ascii="Arial" w:cs="Arial" w:eastAsia="Arial" w:hAnsi="Arial"/>
@@ -189,6 +153,53 @@
                 <w:t xml:space="preserve">kidastro.com</w:t>
               </w:r>
             </w:hyperlink>
+            <w:r>
+              <w:rPr>
+                <w:rFonts w:ascii="Arial" w:cs="Arial" w:eastAsia="Arial" w:hAnsi="Arial"/>
+                <w:color w:val="555555"/>
+                <w:sz w:val="18"/>
+                <w:szCs w:val="18"/>
+              </w:rPr>
+              <w:t xml:space="preserve">  |  </w:t>
+            </w:r>
+            <w:hyperlink w:history="1" r:id="rIdiel1s8kvr-lhnvz-cjb0c">
+              <w:r>
+                <w:rPr>
+                  <w:rFonts w:ascii="Arial" w:cs="Arial" w:eastAsia="Arial" w:hAnsi="Arial"/>
+                  <w:color w:val="555555"/>
+                  <w:sz w:val="18"/>
+                  <w:szCs w:val="18"/>
+                </w:rPr>
+                <w:t xml:space="preserve">linkedin/dkells</w:t>
+              </w:r>
+            </w:hyperlink>
+            <w:r>
+              <w:rPr>
+                <w:rFonts w:ascii="Arial" w:cs="Arial" w:eastAsia="Arial" w:hAnsi="Arial"/>
+              </w:rPr>
+              <w:br/>
+              <w:t xml:space="preserve"/>
+            </w:r>
+            <w:r>
+              <w:rPr>
+                <w:rFonts w:ascii="Arial" w:cs="Arial" w:eastAsia="Arial" w:hAnsi="Arial"/>
+                <w:color w:val="555555"/>
+                <w:sz w:val="18"/>
+                <w:szCs w:val="18"/>
+              </w:rPr>
+              <w:t xml:space="preserve">512.595.6213  |  </w:t>
+            </w:r>
+            <w:hyperlink w:history="1" r:id="rIdszzis0ptftlffof9gbbtm">
+              <w:r>
+                <w:rPr>
+                  <w:rFonts w:ascii="Arial" w:cs="Arial" w:eastAsia="Arial" w:hAnsi="Arial"/>
+                  <w:color w:val="555555"/>
+                  <w:sz w:val="18"/>
+                  <w:szCs w:val="18"/>
+                </w:rPr>
+                <w:t xml:space="preserve">davekeller@me.com</w:t>
+              </w:r>
+            </w:hyperlink>
           </w:p>
         </w:tc>
       </w:tr>
@@ -228,7 +239,7 @@
         <w:rPr>
           <w:rFonts w:ascii="Arial" w:cs="Arial" w:eastAsia="Arial" w:hAnsi="Arial"/>
         </w:rPr>
-        <w:t xml:space="preserve">15+ years leading design on dev/product teams at early-seed startups, often 0 to 1, with experience across industries — AI, data science, entertainment, messaging, ecommerce, fintech and more</w:t>
+        <w:t xml:space="preserve">15+ years leading design at early-stage startups — from 0 to 1 through 2.0 and GTM. Across AI, data science, entertainment, messaging, ecommerce, and fintech.</w:t>
       </w:r>
     </w:p>
     <w:p>
@@ -246,7 +257,7 @@
         <w:rPr>
           <w:rFonts w:ascii="Arial" w:cs="Arial" w:eastAsia="Arial" w:hAnsi="Arial"/>
         </w:rPr>
-        <w:t xml:space="preserve">Strategic product thinker, Figma expert, and front-end dev (HTML/CSS, Tailwind, Claude Code). Experienced in validating ideas with design sprints, prototyping end-to-end flows, and refining production UIs in code</w:t>
+        <w:t xml:space="preserve">A pixel-perfect designer who ships in code. Sweating the visual details — prototyping end-to-end flows and refining high-fidelity production UIs directly in the front-end.</w:t>
       </w:r>
     </w:p>
     <w:p>
@@ -264,7 +275,7 @@
         <w:rPr>
           <w:rFonts w:ascii="Arial" w:cs="Arial" w:eastAsia="Arial" w:hAnsi="Arial"/>
         </w:rPr>
-        <w:t xml:space="preserve">Fluent in agile/sprint workflows and in building process for product teams. Helped create a 'Shape Up' process that organized a ~45-developer company into four product teams, building cross-functionally and shipping consistently on a staggered cadence</w:t>
+        <w:t xml:space="preserve">Process builder and systems architect. Architected multi-platform design systems. Built a process that organized a ~45-developer company into four cross-functional teams shipping on a steady cadence.</w:t>
       </w:r>
     </w:p>
     <w:p>
@@ -282,7 +293,25 @@
         <w:rPr>
           <w:rFonts w:ascii="Arial" w:cs="Arial" w:eastAsia="Arial" w:hAnsi="Arial"/>
         </w:rPr>
-        <w:t xml:space="preserve">Shipped 40+ products across web, iOS, and Android — including a #1 Paid iPhone app and a platform that grossed $33M in year one. Co-founded a 20-person agency and a messaging app that raised $3M</w:t>
+        <w:t xml:space="preserve">Track record. 40+ products across web, iOS, and Android — including a #1 Paid iPhone app and a platform that grossed $33M in year one.</w:t>
+      </w:r>
+    </w:p>
+    <w:p>
+      <w:pPr>
+        <w:pStyle w:val="ListParagraph"/>
+        <w:keepNext w:val="false"/>
+        <w:keepLines/>
+        <w:numPr>
+          <w:ilvl w:val="0"/>
+          <w:numId w:val="2"/>
+        </w:numPr>
+        <w:spacing w:after="140" w:line="260" w:lineRule="atLeast"/>
+      </w:pPr>
+      <w:r>
+        <w:rPr>
+          <w:rFonts w:ascii="Arial" w:cs="Arial" w:eastAsia="Arial" w:hAnsi="Arial"/>
+        </w:rPr>
+        <w:t xml:space="preserve">Founder &amp; client services. Co-founded a 20-person design/dev agency and a $3M-funded messaging app. The agency became a concepting and prototyping shop for Warner Bros — with work for Ellen, DreamWorks, and The Economist along the way.</w:t>
       </w:r>
     </w:p>
     <w:p>
@@ -732,7 +761,7 @@
         <w:rPr>
           <w:rFonts w:ascii="Arial" w:cs="Arial" w:eastAsia="Arial" w:hAnsi="Arial"/>
         </w:rPr>
-        <w:t xml:space="preserve">Co-created the Shape Up process across 4 cross-functional teams and mentored the designers running it</w:t>
+        <w:t xml:space="preserve">Co-created a product-development process across 4 cross-functional teams and mentored the designers running it</w:t>
       </w:r>
     </w:p>
     <w:p>
@@ -1533,7 +1562,7 @@
         <w:rPr>
           <w:rFonts w:ascii="Arial" w:cs="Arial" w:eastAsia="Arial" w:hAnsi="Arial"/>
         </w:rPr>
-        <w:t xml:space="preserve">Guitar and vocals in a rock/metal band · Recording and mixing in Logic Pro · Indoor soccer and racquetball · Mountain biking and endurance sports · International travel (fluent in Spanish) · Adventures with my kids</w:t>
+        <w:t xml:space="preserve">Guitar and vocals in a rock/metal band · Recording and mixing in Logic Pro · Mountain biking and dirt bike racing · Video editing in Final Cut Pro · Indoor soccer and racquetball · International travel (fluent in Spanish)</w:t>
       </w:r>
     </w:p>
     <w:p>
@@ -2073,7 +2102,7 @@
               <w:rPr>
                 <w:rFonts w:ascii="Arial" w:cs="Arial" w:eastAsia="Arial" w:hAnsi="Arial"/>
               </w:rPr>
-              <w:t xml:space="preserve">Agile / Shape Up / design sprints</w:t>
+              <w:t xml:space="preserve">Agile / design sprints</w:t>
             </w:r>
           </w:p>
         </w:tc>

</xml_diff>

<commit_message>
Resume: carry the copy tweaks into the .docx twin too
The resume copy is mirrored in THREE places, not two — resumeData.ts,
make-resume-pdf.py, and make-resume-docx.js. I missed the docx in the
previous commit, which left public/dave-keller-resume.docx on the old
wording; that's the file application portals get, so it matters.

Script updated and the .docx regenerated (verified by reading
word/document.xml back: new wording present, old wording gone).

Co-Authored-By: Claude Opus 5 <noreply@anthropic.com>
</commit_message>
<xml_diff>
--- a/public/dave-keller-resume.docx
+++ b/public/dave-keller-resume.docx
@@ -140,7 +140,7 @@
               </w:rPr>
               <w:t xml:space="preserve">Portfolio: </w:t>
             </w:r>
-            <w:hyperlink w:history="1" r:id="rIdsgkw7btho17xlyl8qb4h3">
+            <w:hyperlink w:history="1" r:id="rIdb4tvxzhzk8havh41uzbja">
               <w:r>
                 <w:rPr>
                   <w:rFonts w:ascii="Arial" w:cs="Arial" w:eastAsia="Arial" w:hAnsi="Arial"/>
@@ -162,7 +162,7 @@
               </w:rPr>
               <w:t xml:space="preserve">  |  </w:t>
             </w:r>
-            <w:hyperlink w:history="1" r:id="rIdiel1s8kvr-lhnvz-cjb0c">
+            <w:hyperlink w:history="1" r:id="rId2m-ddhriorfyvoiwwpnck">
               <w:r>
                 <w:rPr>
                   <w:rFonts w:ascii="Arial" w:cs="Arial" w:eastAsia="Arial" w:hAnsi="Arial"/>
@@ -189,7 +189,7 @@
               </w:rPr>
               <w:t xml:space="preserve">512.595.6213  |  </w:t>
             </w:r>
-            <w:hyperlink w:history="1" r:id="rIdszzis0ptftlffof9gbbtm">
+            <w:hyperlink w:history="1" r:id="rIda25b4iw-7zc3gb4vjb8en">
               <w:r>
                 <w:rPr>
                   <w:rFonts w:ascii="Arial" w:cs="Arial" w:eastAsia="Arial" w:hAnsi="Arial"/>
@@ -275,7 +275,7 @@
         <w:rPr>
           <w:rFonts w:ascii="Arial" w:cs="Arial" w:eastAsia="Arial" w:hAnsi="Arial"/>
         </w:rPr>
-        <w:t xml:space="preserve">Process builder and systems architect. Architected multi-platform design systems. Built a process that organized a ~45-developer company into four cross-functional teams shipping on a steady cadence.</w:t>
+        <w:t xml:space="preserve">Design system architect and process builder. Architected multi-platform design systems. Built a process that organized a ~45-developer company into four cross-functional teams shipping on a steady cadence.</w:t>
       </w:r>
     </w:p>
     <w:p>
@@ -293,7 +293,7 @@
         <w:rPr>
           <w:rFonts w:ascii="Arial" w:cs="Arial" w:eastAsia="Arial" w:hAnsi="Arial"/>
         </w:rPr>
-        <w:t xml:space="preserve">Track record. 40+ products across web, iOS, and Android — including a #1 Paid iPhone app and a platform that grossed $33M in year one.</w:t>
+        <w:t xml:space="preserve">Track record. 40+ products across web, iOS, and Android — including a #1 Paid iPhone app and a 0 → 1 platform that grossed $33M in year one.</w:t>
       </w:r>
     </w:p>
     <w:p>

</xml_diff>

<commit_message>
Resume: consistency pass on language and grammar
Six fixes, each a lone outlier against a clear dominant pattern in the
same document — applied to all three mirrors (resumeData.ts,
make-resume-pdf.py, make-resume-docx.js) and both artifacts regenerated:

- Serial comma: 'Cursor and Tailwind' and 'Trello and Notion' were the
  only two lists missing it; 11 others already use ', and'.
- 'Fortune-100' -> 'Fortune 100', matching 'Fortune 500'.
- 'Warner Bros' -> 'Warner Bros.'; two of three already had the period.
- toolGroups: 'design systems / component libraries' was the only entry
  starting lowercase (14 of 15 are capitalized).
- toolGroups: 'Data Viz and Animation libraries' was the only entry
  using 'and' as a separator; the other 14 use ' / '.
- Grammar: 'Designing in front-end' -> 'Designing in the front-end',
  matching the article used in the highlights bullet.

No voice or claims changed — these are all mechanical.

Co-Authored-By: Claude Opus 5 <noreply@anthropic.com>
</commit_message>
<xml_diff>
--- a/public/dave-keller-resume.docx
+++ b/public/dave-keller-resume.docx
@@ -140,7 +140,7 @@
               </w:rPr>
               <w:t xml:space="preserve">Portfolio: </w:t>
             </w:r>
-            <w:hyperlink w:history="1" r:id="rIdb4tvxzhzk8havh41uzbja">
+            <w:hyperlink w:history="1" r:id="rIdi-kvmchfazpny0qiyybnp">
               <w:r>
                 <w:rPr>
                   <w:rFonts w:ascii="Arial" w:cs="Arial" w:eastAsia="Arial" w:hAnsi="Arial"/>
@@ -162,7 +162,7 @@
               </w:rPr>
               <w:t xml:space="preserve">  |  </w:t>
             </w:r>
-            <w:hyperlink w:history="1" r:id="rId2m-ddhriorfyvoiwwpnck">
+            <w:hyperlink w:history="1" r:id="rIdp0gzdoyn7fxw6-ahct-uz">
               <w:r>
                 <w:rPr>
                   <w:rFonts w:ascii="Arial" w:cs="Arial" w:eastAsia="Arial" w:hAnsi="Arial"/>
@@ -189,7 +189,7 @@
               </w:rPr>
               <w:t xml:space="preserve">512.595.6213  |  </w:t>
             </w:r>
-            <w:hyperlink w:history="1" r:id="rIda25b4iw-7zc3gb4vjb8en">
+            <w:hyperlink w:history="1" r:id="rIdgcyfje5u1qx8davtdnxqp">
               <w:r>
                 <w:rPr>
                   <w:rFonts w:ascii="Arial" w:cs="Arial" w:eastAsia="Arial" w:hAnsi="Arial"/>
@@ -311,7 +311,7 @@
         <w:rPr>
           <w:rFonts w:ascii="Arial" w:cs="Arial" w:eastAsia="Arial" w:hAnsi="Arial"/>
         </w:rPr>
-        <w:t xml:space="preserve">Founder &amp; client services. Co-founded a 20-person design/dev agency and a $3M-funded messaging app. The agency became a concepting and prototyping shop for Warner Bros — with work for Ellen, DreamWorks, and The Economist along the way.</w:t>
+        <w:t xml:space="preserve">Founder &amp; client services. Co-founded a 20-person design/dev agency and a $3M-funded messaging app. The agency became a concepting and prototyping shop for Warner Bros. — with work for Ellen, DreamWorks, and The Economist along the way.</w:t>
       </w:r>
     </w:p>
     <w:p>
@@ -367,7 +367,7 @@
         <w:rPr>
           <w:rFonts w:ascii="Arial" w:cs="Arial" w:eastAsia="Arial" w:hAnsi="Arial"/>
         </w:rPr>
-        <w:t xml:space="preserve">Designing in front-end (prototypes to production) with Claude Code, Cursor and Tailwind</w:t>
+        <w:t xml:space="preserve">Designing in the front-end (prototypes to production) with Claude Code, Cursor, and Tailwind</w:t>
       </w:r>
     </w:p>
     <w:p>
@@ -403,7 +403,7 @@
         <w:rPr>
           <w:rFonts w:ascii="Arial" w:cs="Arial" w:eastAsia="Arial" w:hAnsi="Arial"/>
         </w:rPr>
-        <w:t xml:space="preserve">Fluent in GitHub — push/pull, branches, and PRs; Linear, Trello and Notion for sprint planning and docs</w:t>
+        <w:t xml:space="preserve">Fluent in GitHub — push/pull, branches, and PRs; Linear, Trello, and Notion for sprint planning and docs</w:t>
       </w:r>
     </w:p>
     <w:p>
@@ -1187,7 +1187,7 @@
         <w:rPr>
           <w:rFonts w:ascii="Arial" w:cs="Arial" w:eastAsia="Arial" w:hAnsi="Arial"/>
         </w:rPr>
-        <w:t xml:space="preserve">Designed Rodio, a retail workforce communication platform. Partnered with Fortune-100 Kronos and signed MarketSource (Target/Best Buy), reaching millions of daily interactions.</w:t>
+        <w:t xml:space="preserve">Designed Rodio, a retail workforce communication platform. Partnered with Fortune 100 Kronos and signed MarketSource (Target/Best Buy), reaching millions of daily interactions.</w:t>
       </w:r>
     </w:p>
     <w:p>
@@ -1698,7 +1698,7 @@
               <w:rPr>
                 <w:rFonts w:ascii="Arial" w:cs="Arial" w:eastAsia="Arial" w:hAnsi="Arial"/>
               </w:rPr>
-              <w:t xml:space="preserve">design systems / component libraries</w:t>
+              <w:t xml:space="preserve">Design systems / component libraries</w:t>
             </w:r>
           </w:p>
         </w:tc>
@@ -1766,7 +1766,7 @@
               <w:rPr>
                 <w:rFonts w:ascii="Arial" w:cs="Arial" w:eastAsia="Arial" w:hAnsi="Arial"/>
               </w:rPr>
-              <w:t xml:space="preserve">Data Viz and Animation libraries</w:t>
+              <w:t xml:space="preserve">Data Viz / Animation libraries</w:t>
             </w:r>
           </w:p>
         </w:tc>

</xml_diff>

<commit_message>
Resume: consistency pass, second round
Four judgment calls Dave approved:

- Numerals: 'into four cross-functional teams' -> 'into 4', matching the
  QuotaPath bullet and the numerals used everywhere else (3-person,
  40+, ~45-developer, 20-person).
- '0 to 1' now reads '0 → 1' in the first highlight too, matching the
  track-record bullet.
- Skills parallelism: 'Designing in the front-end' -> 'Experienced
  designing in the front-end', so all four bullets open on an adjective
  (Expert / Experienced / Comfortable / Fluent).
- Highlight structure: the first bullet now leads with a label sentence
  like the other four — '15+ years leading design at early-stage
  startups.' followed by the detail — instead of an em-dash clause and a
  trailing fragment.

All three mirrors updated; PDF and .docx regenerated and verified.

Co-Authored-By: Claude Opus 5 <noreply@anthropic.com>
</commit_message>
<xml_diff>
--- a/public/dave-keller-resume.docx
+++ b/public/dave-keller-resume.docx
@@ -140,7 +140,7 @@
               </w:rPr>
               <w:t xml:space="preserve">Portfolio: </w:t>
             </w:r>
-            <w:hyperlink w:history="1" r:id="rIdi-kvmchfazpny0qiyybnp">
+            <w:hyperlink w:history="1" r:id="rIdsvmhuhxuoavb32ugvvfaa">
               <w:r>
                 <w:rPr>
                   <w:rFonts w:ascii="Arial" w:cs="Arial" w:eastAsia="Arial" w:hAnsi="Arial"/>
@@ -162,7 +162,7 @@
               </w:rPr>
               <w:t xml:space="preserve">  |  </w:t>
             </w:r>
-            <w:hyperlink w:history="1" r:id="rIdp0gzdoyn7fxw6-ahct-uz">
+            <w:hyperlink w:history="1" r:id="rId4espe2xsacy7qgmqfinb5">
               <w:r>
                 <w:rPr>
                   <w:rFonts w:ascii="Arial" w:cs="Arial" w:eastAsia="Arial" w:hAnsi="Arial"/>
@@ -189,7 +189,7 @@
               </w:rPr>
               <w:t xml:space="preserve">512.595.6213  |  </w:t>
             </w:r>
-            <w:hyperlink w:history="1" r:id="rIdgcyfje5u1qx8davtdnxqp">
+            <w:hyperlink w:history="1" r:id="rIdsh6pmj8xksdfnjdrjhwec">
               <w:r>
                 <w:rPr>
                   <w:rFonts w:ascii="Arial" w:cs="Arial" w:eastAsia="Arial" w:hAnsi="Arial"/>
@@ -239,7 +239,7 @@
         <w:rPr>
           <w:rFonts w:ascii="Arial" w:cs="Arial" w:eastAsia="Arial" w:hAnsi="Arial"/>
         </w:rPr>
-        <w:t xml:space="preserve">15+ years leading design at early-stage startups — from 0 to 1 through 2.0 and GTM. Across AI, data science, entertainment, messaging, ecommerce, and fintech.</w:t>
+        <w:t xml:space="preserve">15+ years leading design at early-stage startups. From 0 → 1 through 2.0 and GTM, across AI, data science, entertainment, messaging, ecommerce, and fintech.</w:t>
       </w:r>
     </w:p>
     <w:p>
@@ -275,7 +275,7 @@
         <w:rPr>
           <w:rFonts w:ascii="Arial" w:cs="Arial" w:eastAsia="Arial" w:hAnsi="Arial"/>
         </w:rPr>
-        <w:t xml:space="preserve">Design system architect and process builder. Architected multi-platform design systems. Built a process that organized a ~45-developer company into four cross-functional teams shipping on a steady cadence.</w:t>
+        <w:t xml:space="preserve">Design system architect and process builder. Architected multi-platform design systems. Built a process that organized a ~45-developer company into 4 cross-functional teams shipping on a steady cadence.</w:t>
       </w:r>
     </w:p>
     <w:p>
@@ -367,7 +367,7 @@
         <w:rPr>
           <w:rFonts w:ascii="Arial" w:cs="Arial" w:eastAsia="Arial" w:hAnsi="Arial"/>
         </w:rPr>
-        <w:t xml:space="preserve">Designing in the front-end (prototypes to production) with Claude Code, Cursor, and Tailwind</w:t>
+        <w:t xml:space="preserve">Experienced designing in the front-end (prototypes to production) with Claude Code, Cursor, and Tailwind</w:t>
       </w:r>
     </w:p>
     <w:p>

</xml_diff>

<commit_message>
Resume downloads: design systems, plural
The PDF/DOCX generator scripts mirror resumeData.ts and missed the
Rodio pluralization — update the bullet and regenerate both files.

Co-Authored-By: Claude Fable 5 <noreply@anthropic.com>
</commit_message>
<xml_diff>
--- a/public/dave-keller-resume.docx
+++ b/public/dave-keller-resume.docx
@@ -140,7 +140,7 @@
               </w:rPr>
               <w:t xml:space="preserve">Portfolio: </w:t>
             </w:r>
-            <w:hyperlink w:history="1" r:id="rIdsvmhuhxuoavb32ugvvfaa">
+            <w:hyperlink w:history="1" r:id="rIdtdri-0nvvgd2id7ridlqm">
               <w:r>
                 <w:rPr>
                   <w:rFonts w:ascii="Arial" w:cs="Arial" w:eastAsia="Arial" w:hAnsi="Arial"/>
@@ -162,7 +162,7 @@
               </w:rPr>
               <w:t xml:space="preserve">  |  </w:t>
             </w:r>
-            <w:hyperlink w:history="1" r:id="rId4espe2xsacy7qgmqfinb5">
+            <w:hyperlink w:history="1" r:id="rIdipu1_yitww4yjhgrdwlv8">
               <w:r>
                 <w:rPr>
                   <w:rFonts w:ascii="Arial" w:cs="Arial" w:eastAsia="Arial" w:hAnsi="Arial"/>
@@ -189,7 +189,7 @@
               </w:rPr>
               <w:t xml:space="preserve">512.595.6213  |  </w:t>
             </w:r>
-            <w:hyperlink w:history="1" r:id="rIdsh6pmj8xksdfnjdrjhwec">
+            <w:hyperlink w:history="1" r:id="rIdw9tlgacibb9udhtjdox_h">
               <w:r>
                 <w:rPr>
                   <w:rFonts w:ascii="Arial" w:cs="Arial" w:eastAsia="Arial" w:hAnsi="Arial"/>
@@ -1205,7 +1205,7 @@
         <w:rPr>
           <w:rFonts w:ascii="Arial" w:cs="Arial" w:eastAsia="Arial" w:hAnsi="Arial"/>
         </w:rPr>
-        <w:t xml:space="preserve">Built Rodio's multi-platform design system (master, web, iOS, Android) and led a team of 20 to 20K+ paid users</w:t>
+        <w:t xml:space="preserve">Built Rodio's multi-platform design systems (master, web, iOS, Android) and led a team of 20 to 20K+ paid users</w:t>
       </w:r>
     </w:p>
     <w:p>

</xml_diff>

<commit_message>
Trim the promotion suffix from the Strangeworks role line
The role line read "Principal Product Designer / Design Engineer ·
promoted from Senior Product Designer (Apr 2024)". Combined with the
location the PDF appends to the same line, it wrapped and left a
one-word orphan.

Drops the suffix everywhere the role line appears — the resume page,
both generator scripts, and the two superseded design docs — leaving
"Principal Product Designer / Design Engineer". The line now fits on
one line in the PDF.

Regenerates public/dave-keller-resume.{pdf,docx}.

The promotion itself is still carried by the first bullet ("Promoted to
Principal Product Designer in 6 months"), which is left intact.

Co-Authored-By: Claude Opus 5 <noreply@anthropic.com>
</commit_message>
<xml_diff>
--- a/public/dave-keller-resume.docx
+++ b/public/dave-keller-resume.docx
@@ -140,7 +140,7 @@
               </w:rPr>
               <w:t xml:space="preserve">Portfolio: </w:t>
             </w:r>
-            <w:hyperlink w:history="1" r:id="rIdcktchnf89sc5usoalvjtq">
+            <w:hyperlink w:history="1" r:id="rId4z4_uetcxmbkqqj0hfjq8">
               <w:r>
                 <w:rPr>
                   <w:rFonts w:ascii="Arial" w:cs="Arial" w:eastAsia="Arial" w:hAnsi="Arial"/>
@@ -162,7 +162,7 @@
               </w:rPr>
               <w:t xml:space="preserve">  |  </w:t>
             </w:r>
-            <w:hyperlink w:history="1" r:id="rIdehyqpgrr4fhhm3ihqexjb">
+            <w:hyperlink w:history="1" r:id="rIdmsd3mhfbpsc3fjxaat5fz">
               <w:r>
                 <w:rPr>
                   <w:rFonts w:ascii="Arial" w:cs="Arial" w:eastAsia="Arial" w:hAnsi="Arial"/>
@@ -189,7 +189,7 @@
               </w:rPr>
               <w:t xml:space="preserve">512.595.6213  |  </w:t>
             </w:r>
-            <w:hyperlink w:history="1" r:id="rIdolymbwj5kipgis4c-0ldd">
+            <w:hyperlink w:history="1" r:id="rIdad4fdfznueqzgwokjvjo6">
               <w:r>
                 <w:rPr>
                   <w:rFonts w:ascii="Arial" w:cs="Arial" w:eastAsia="Arial" w:hAnsi="Arial"/>
@@ -522,7 +522,7 @@
           <w:iCs/>
           <w:color w:val="555555"/>
         </w:rPr>
-        <w:t xml:space="preserve">Principal Product Designer / Design Engineer · promoted from Senior Product Designer (Apr 2024) · Remote / Austin, TX</w:t>
+        <w:t xml:space="preserve">Principal Product Designer / Design Engineer · Remote / Austin, TX</w:t>
       </w:r>
     </w:p>
     <w:p>

</xml_diff>

<commit_message>
Fix the orphaned line at the bottom of resume page 1
The last QuotaPath bullet ended "...and mentored the designers running
it", which wrapped and left "designers running it" alone on the final
line at the bottom edge of page 1.

Shortens it to "...and mentored its designers" so the bullet fits on one
line. Applied to the resume page and both generator scripts, and
regenerates public/dave-keller-resume.{pdf,docx}.

Co-Authored-By: Claude Opus 5 <noreply@anthropic.com>
</commit_message>
<xml_diff>
--- a/public/dave-keller-resume.docx
+++ b/public/dave-keller-resume.docx
@@ -140,7 +140,7 @@
               </w:rPr>
               <w:t xml:space="preserve">Portfolio: </w:t>
             </w:r>
-            <w:hyperlink w:history="1" r:id="rId4z4_uetcxmbkqqj0hfjq8">
+            <w:hyperlink w:history="1" r:id="rIdsuypisryjajcdwx-mfnic">
               <w:r>
                 <w:rPr>
                   <w:rFonts w:ascii="Arial" w:cs="Arial" w:eastAsia="Arial" w:hAnsi="Arial"/>
@@ -162,7 +162,7 @@
               </w:rPr>
               <w:t xml:space="preserve">  |  </w:t>
             </w:r>
-            <w:hyperlink w:history="1" r:id="rIdmsd3mhfbpsc3fjxaat5fz">
+            <w:hyperlink w:history="1" r:id="rIdojlnbqvt-5vdsrpj7qn_q">
               <w:r>
                 <w:rPr>
                   <w:rFonts w:ascii="Arial" w:cs="Arial" w:eastAsia="Arial" w:hAnsi="Arial"/>
@@ -189,7 +189,7 @@
               </w:rPr>
               <w:t xml:space="preserve">512.595.6213  |  </w:t>
             </w:r>
-            <w:hyperlink w:history="1" r:id="rIdad4fdfznueqzgwokjvjo6">
+            <w:hyperlink w:history="1" r:id="rId1mwj6bmwzjyo-ozrbynbn">
               <w:r>
                 <w:rPr>
                   <w:rFonts w:ascii="Arial" w:cs="Arial" w:eastAsia="Arial" w:hAnsi="Arial"/>
@@ -761,7 +761,7 @@
         <w:rPr>
           <w:rFonts w:ascii="Arial" w:cs="Arial" w:eastAsia="Arial" w:hAnsi="Arial"/>
         </w:rPr>
-        <w:t xml:space="preserve">Co-created a product-development process across 4 cross-functional teams and mentored the designers running it</w:t>
+        <w:t xml:space="preserve">Co-created a product-development process across 4 cross-functional teams and mentored its designers</w:t>
       </w:r>
     </w:p>
     <w:p>

</xml_diff>

<commit_message>
Drop "UX/UI" from resume and case-study titles
"Product UX/UI Designer" was a hedge from when the industry was
mid-rename. "Product designer" is now the plain term, so use it:

- Senior Product UX/UI Designer      -> Senior Product Designer
- Product UX/UI Design Lead          -> Lead Product Designer
- Co-Founder · Product UX/UI Design Lead -> Co-Founder · Lead Product Designer

Applied to all three mirrors of the resume copy (resumeData.ts, the
PDF script, the docx script) plus the QuotaPath, Rodio, and BnbFinder
case-study pages. "Lead Product Designer" matches the form already used
in Timebomb.tsx and the site metadata.

Regenerated public/dave-keller-resume.pdf and .docx — still 2 pages
with the same page break after QuotaPath.

Co-Authored-By: Claude Opus 5 <noreply@anthropic.com>
</commit_message>
<xml_diff>
--- a/public/dave-keller-resume.docx
+++ b/public/dave-keller-resume.docx
@@ -140,7 +140,7 @@
               </w:rPr>
               <w:t xml:space="preserve">Portfolio: </w:t>
             </w:r>
-            <w:hyperlink w:history="1" r:id="rIdsuypisryjajcdwx-mfnic">
+            <w:hyperlink w:history="1" r:id="rIdsetnnj8vrglkwwofknvv6">
               <w:r>
                 <w:rPr>
                   <w:rFonts w:ascii="Arial" w:cs="Arial" w:eastAsia="Arial" w:hAnsi="Arial"/>
@@ -162,7 +162,7 @@
               </w:rPr>
               <w:t xml:space="preserve">  |  </w:t>
             </w:r>
-            <w:hyperlink w:history="1" r:id="rIdojlnbqvt-5vdsrpj7qn_q">
+            <w:hyperlink w:history="1" r:id="rId5kq3pjxz8ltbqycfol3tb">
               <w:r>
                 <w:rPr>
                   <w:rFonts w:ascii="Arial" w:cs="Arial" w:eastAsia="Arial" w:hAnsi="Arial"/>
@@ -189,7 +189,7 @@
               </w:rPr>
               <w:t xml:space="preserve">512.595.6213  |  </w:t>
             </w:r>
-            <w:hyperlink w:history="1" r:id="rId1mwj6bmwzjyo-ozrbynbn">
+            <w:hyperlink w:history="1" r:id="rIddo0uoopxtx5qr9bxit8ub">
               <w:r>
                 <w:rPr>
                   <w:rFonts w:ascii="Arial" w:cs="Arial" w:eastAsia="Arial" w:hAnsi="Arial"/>
@@ -694,7 +694,7 @@
           <w:iCs/>
           <w:color w:val="555555"/>
         </w:rPr>
-        <w:t xml:space="preserve">Senior Product UX/UI Designer · Hybrid / Austin, TX</w:t>
+        <w:t xml:space="preserve">Senior Product Designer · Hybrid / Austin, TX</w:t>
       </w:r>
     </w:p>
     <w:p>
@@ -866,7 +866,7 @@
           <w:iCs/>
           <w:color w:val="555555"/>
         </w:rPr>
-        <w:t xml:space="preserve">Product UX/UI Design Lead · Front-End Developer · Austin, TX</w:t>
+        <w:t xml:space="preserve">Lead Product Designer · Front-End Developer · Austin, TX</w:t>
       </w:r>
     </w:p>
     <w:p>
@@ -1020,7 +1020,7 @@
           <w:iCs/>
           <w:color w:val="555555"/>
         </w:rPr>
-        <w:t xml:space="preserve">Product UX/UI Design Lead · Front-End Developer · Austin, TX</w:t>
+        <w:t xml:space="preserve">Lead Product Designer · Front-End Developer · Austin, TX</w:t>
       </w:r>
     </w:p>
     <w:p>
@@ -1174,7 +1174,7 @@
           <w:iCs/>
           <w:color w:val="555555"/>
         </w:rPr>
-        <w:t xml:space="preserve">Product UX/UI Design Lead · Austin, TX</w:t>
+        <w:t xml:space="preserve">Lead Product Designer · Austin, TX</w:t>
       </w:r>
     </w:p>
     <w:p>
@@ -1328,7 +1328,7 @@
           <w:iCs/>
           <w:color w:val="555555"/>
         </w:rPr>
-        <w:t xml:space="preserve">Co-Founder · Product UX/UI Design Lead · Austin, TX</w:t>
+        <w:t xml:space="preserve">Co-Founder · Lead Product Designer · Austin, TX</w:t>
       </w:r>
     </w:p>
     <w:p>

</xml_diff>

<commit_message>
Align resume titles with LinkedIn
Two corrections after comparing against the live LinkedIn profile:

- Lead roles use "Product Design Lead" (LinkedIn's phrasing) rather than
  "Lead Product Designer" — OneAssembly, BnbFinder, Timebomb.
- Phobio : Rodio is "Principal Product Designer", not a lead-level title.

Also updated the Timebomb and Rodio case-study pages to match, and
regenerated the print PDF and docx.

Co-Authored-By: Claude Opus 5 <noreply@anthropic.com>
</commit_message>
<xml_diff>
--- a/public/dave-keller-resume.docx
+++ b/public/dave-keller-resume.docx
@@ -140,7 +140,7 @@
               </w:rPr>
               <w:t xml:space="preserve">Portfolio: </w:t>
             </w:r>
-            <w:hyperlink w:history="1" r:id="rIdsetnnj8vrglkwwofknvv6">
+            <w:hyperlink w:history="1" r:id="rId6o14_dr6iyc53_wy3qhwe">
               <w:r>
                 <w:rPr>
                   <w:rFonts w:ascii="Arial" w:cs="Arial" w:eastAsia="Arial" w:hAnsi="Arial"/>
@@ -162,7 +162,7 @@
               </w:rPr>
               <w:t xml:space="preserve">  |  </w:t>
             </w:r>
-            <w:hyperlink w:history="1" r:id="rId5kq3pjxz8ltbqycfol3tb">
+            <w:hyperlink w:history="1" r:id="rIdr2y0jcdh6yt-l7yipvtix">
               <w:r>
                 <w:rPr>
                   <w:rFonts w:ascii="Arial" w:cs="Arial" w:eastAsia="Arial" w:hAnsi="Arial"/>
@@ -189,7 +189,7 @@
               </w:rPr>
               <w:t xml:space="preserve">512.595.6213  |  </w:t>
             </w:r>
-            <w:hyperlink w:history="1" r:id="rIddo0uoopxtx5qr9bxit8ub">
+            <w:hyperlink w:history="1" r:id="rIdwlvtxhsbnbnbjgc2xvtyk">
               <w:r>
                 <w:rPr>
                   <w:rFonts w:ascii="Arial" w:cs="Arial" w:eastAsia="Arial" w:hAnsi="Arial"/>
@@ -866,7 +866,7 @@
           <w:iCs/>
           <w:color w:val="555555"/>
         </w:rPr>
-        <w:t xml:space="preserve">Lead Product Designer · Front-End Developer · Austin, TX</w:t>
+        <w:t xml:space="preserve">Product Design Lead · Front-End Developer · Austin, TX</w:t>
       </w:r>
     </w:p>
     <w:p>
@@ -1020,7 +1020,7 @@
           <w:iCs/>
           <w:color w:val="555555"/>
         </w:rPr>
-        <w:t xml:space="preserve">Lead Product Designer · Front-End Developer · Austin, TX</w:t>
+        <w:t xml:space="preserve">Product Design Lead · Front-End Developer · Austin, TX</w:t>
       </w:r>
     </w:p>
     <w:p>
@@ -1174,7 +1174,7 @@
           <w:iCs/>
           <w:color w:val="555555"/>
         </w:rPr>
-        <w:t xml:space="preserve">Lead Product Designer · Austin, TX</w:t>
+        <w:t xml:space="preserve">Principal Product Designer · Austin, TX</w:t>
       </w:r>
     </w:p>
     <w:p>
@@ -1328,7 +1328,7 @@
           <w:iCs/>
           <w:color w:val="555555"/>
         </w:rPr>
-        <w:t xml:space="preserve">Co-Founder · Lead Product Designer · Austin, TX</w:t>
+        <w:t xml:space="preserve">Co-Founder · Product Design Lead · Austin, TX</w:t>
       </w:r>
     </w:p>
     <w:p>

</xml_diff>

<commit_message>
Use "&" consistently in every resume job title
The title rows mixed three separators — "/" at Strangeworks, "·" at the
four jobs below it, and nothing at the two single-title roles. Standardize
on "&", and take LinkedIn's wording where it differed ("Product Design
Lead" -> "Lead Product Designer", and Made by Rocket trimmed to
"Co-Founder & Product Designer").

Applied to all three places a title lives: the page data, the PDF script,
and the DOCX script — plus the header tagline, which had the same stray
slash. Regenerated both downloadable files.

Co-Authored-By: Claude Opus 5 <noreply@anthropic.com>
</commit_message>
<xml_diff>
--- a/public/dave-keller-resume.docx
+++ b/public/dave-keller-resume.docx
@@ -111,7 +111,7 @@
                 <w:sz w:val="21"/>
                 <w:szCs w:val="21"/>
               </w:rPr>
-              <w:t xml:space="preserve">principal product designer / design engineer</w:t>
+              <w:t xml:space="preserve">principal product designer &amp; design engineer</w:t>
             </w:r>
           </w:p>
         </w:tc>
@@ -140,7 +140,7 @@
               </w:rPr>
               <w:t xml:space="preserve">Portfolio: </w:t>
             </w:r>
-            <w:hyperlink w:history="1" r:id="rId6o14_dr6iyc53_wy3qhwe">
+            <w:hyperlink w:history="1" r:id="rId3zx6mzffi1wdgfjng6xtz">
               <w:r>
                 <w:rPr>
                   <w:rFonts w:ascii="Arial" w:cs="Arial" w:eastAsia="Arial" w:hAnsi="Arial"/>
@@ -162,7 +162,7 @@
               </w:rPr>
               <w:t xml:space="preserve">  |  </w:t>
             </w:r>
-            <w:hyperlink w:history="1" r:id="rIdr2y0jcdh6yt-l7yipvtix">
+            <w:hyperlink w:history="1" r:id="rIdq3etwfemmmsdytx6k10e1">
               <w:r>
                 <w:rPr>
                   <w:rFonts w:ascii="Arial" w:cs="Arial" w:eastAsia="Arial" w:hAnsi="Arial"/>
@@ -189,7 +189,7 @@
               </w:rPr>
               <w:t xml:space="preserve">512.595.6213  |  </w:t>
             </w:r>
-            <w:hyperlink w:history="1" r:id="rIdwlvtxhsbnbnbjgc2xvtyk">
+            <w:hyperlink w:history="1" r:id="rIdcvuv1i2jkoday8o2ookc0">
               <w:r>
                 <w:rPr>
                   <w:rFonts w:ascii="Arial" w:cs="Arial" w:eastAsia="Arial" w:hAnsi="Arial"/>
@@ -522,7 +522,7 @@
           <w:iCs/>
           <w:color w:val="555555"/>
         </w:rPr>
-        <w:t xml:space="preserve">Principal Product Designer / Design Engineer · Remote / Austin, TX</w:t>
+        <w:t xml:space="preserve">Principal Product Designer &amp; Design Engineer · Remote / Austin, TX</w:t>
       </w:r>
     </w:p>
     <w:p>
@@ -866,7 +866,7 @@
           <w:iCs/>
           <w:color w:val="555555"/>
         </w:rPr>
-        <w:t xml:space="preserve">Product Design Lead · Front-End Developer · Austin, TX</w:t>
+        <w:t xml:space="preserve">Lead Product Designer &amp; Front-End Developer · Austin, TX</w:t>
       </w:r>
     </w:p>
     <w:p>
@@ -1020,7 +1020,7 @@
           <w:iCs/>
           <w:color w:val="555555"/>
         </w:rPr>
-        <w:t xml:space="preserve">Product Design Lead · Front-End Developer · Austin, TX</w:t>
+        <w:t xml:space="preserve">Lead Product Designer &amp; Front-End Developer · Austin, TX</w:t>
       </w:r>
     </w:p>
     <w:p>
@@ -1328,7 +1328,7 @@
           <w:iCs/>
           <w:color w:val="555555"/>
         </w:rPr>
-        <w:t xml:space="preserve">Co-Founder · Product Design Lead · Austin, TX</w:t>
+        <w:t xml:space="preserve">Co-Founder &amp; Lead Product Designer · Austin, TX</w:t>
       </w:r>
     </w:p>
     <w:p>
@@ -1482,7 +1482,7 @@
           <w:iCs/>
           <w:color w:val="555555"/>
         </w:rPr>
-        <w:t xml:space="preserve">Co-Founder · Product Designer · Front-End Developer · Austin, TX</w:t>
+        <w:t xml:space="preserve">Co-Founder &amp; Product Designer · Austin, TX</w:t>
       </w:r>
     </w:p>
     <w:p>

</xml_diff>

<commit_message>
Sync the resume highlights with the LinkedIn About bullets
Three edits, matching the wording Dave settled on in LinkedIn:

- "directly in the front-end" -> "directly in front-end code"
- "Design system architect" -> "Design systems architect"
- "Built a process" -> "Built a product process"

Plus bullet 1 restructured to LinkedIn's shape (em dash, then "Across AI…"
as its own sentence). Kept the resume's "0 → 1" spacing, which plain-text
LinkedIn can't render.

Applied to the page data and both generator scripts; PDF and DOCX
regenerated.

Co-Authored-By: Claude Opus 5 <noreply@anthropic.com>
</commit_message>
<xml_diff>
--- a/public/dave-keller-resume.docx
+++ b/public/dave-keller-resume.docx
@@ -140,7 +140,7 @@
               </w:rPr>
               <w:t xml:space="preserve">Portfolio: </w:t>
             </w:r>
-            <w:hyperlink w:history="1" r:id="rId3zx6mzffi1wdgfjng6xtz">
+            <w:hyperlink w:history="1" r:id="rIdorz-hrhibk9wkhvhh8lcf">
               <w:r>
                 <w:rPr>
                   <w:rFonts w:ascii="Arial" w:cs="Arial" w:eastAsia="Arial" w:hAnsi="Arial"/>
@@ -162,7 +162,7 @@
               </w:rPr>
               <w:t xml:space="preserve">  |  </w:t>
             </w:r>
-            <w:hyperlink w:history="1" r:id="rIdq3etwfemmmsdytx6k10e1">
+            <w:hyperlink w:history="1" r:id="rId7fd-tpz2hsrlgjegc3nnq">
               <w:r>
                 <w:rPr>
                   <w:rFonts w:ascii="Arial" w:cs="Arial" w:eastAsia="Arial" w:hAnsi="Arial"/>
@@ -189,7 +189,7 @@
               </w:rPr>
               <w:t xml:space="preserve">512.595.6213  |  </w:t>
             </w:r>
-            <w:hyperlink w:history="1" r:id="rIdcvuv1i2jkoday8o2ookc0">
+            <w:hyperlink w:history="1" r:id="rIdwzvwh38hc7vjkoty859z8">
               <w:r>
                 <w:rPr>
                   <w:rFonts w:ascii="Arial" w:cs="Arial" w:eastAsia="Arial" w:hAnsi="Arial"/>
@@ -239,7 +239,7 @@
         <w:rPr>
           <w:rFonts w:ascii="Arial" w:cs="Arial" w:eastAsia="Arial" w:hAnsi="Arial"/>
         </w:rPr>
-        <w:t xml:space="preserve">15+ years leading design at early-stage startups. From 0 → 1 through 2.0 and GTM, across AI, data science, entertainment, messaging, ecommerce, and fintech.</w:t>
+        <w:t xml:space="preserve">15+ years leading design at early-stage startups — from 0 → 1 through 2.0 and GTM. Across AI, data science, entertainment, messaging, ecommerce, and fintech.</w:t>
       </w:r>
     </w:p>
     <w:p>
@@ -257,7 +257,7 @@
         <w:rPr>
           <w:rFonts w:ascii="Arial" w:cs="Arial" w:eastAsia="Arial" w:hAnsi="Arial"/>
         </w:rPr>
-        <w:t xml:space="preserve">A pixel-perfect designer who ships in code. Sweating the visual details — prototyping end-to-end flows and refining high-fidelity production UIs directly in the front-end.</w:t>
+        <w:t xml:space="preserve">A pixel-perfect designer who ships in code. Sweating the visual details — prototyping end-to-end flows and refining high-fidelity production UIs directly in front-end code.</w:t>
       </w:r>
     </w:p>
     <w:p>
@@ -275,7 +275,7 @@
         <w:rPr>
           <w:rFonts w:ascii="Arial" w:cs="Arial" w:eastAsia="Arial" w:hAnsi="Arial"/>
         </w:rPr>
-        <w:t xml:space="preserve">Design system architect and process builder. Architected multi-platform design systems. Built a process that organized a ~45-developer company into 4 cross-functional teams shipping on a steady cadence.</w:t>
+        <w:t xml:space="preserve">Design systems architect and process builder. Architected multi-platform design systems. Built a product process that organized a ~45-developer company into 4 cross-functional teams shipping on a steady cadence.</w:t>
       </w:r>
     </w:p>
     <w:p>

</xml_diff>